<commit_message>
Regenerate PDF and Word version with new heading and matching palette
The .docx (for Google Docs) now matches the current forest/amber
palette and content: real Bring!/AnyList ratings, the survey-quotes
section, and the "qué construimos" table that were only in the HTML
before.

Co-Authored-By: Claude Sonnet 5 <noreply@anthropic.com>
Claude-Session: https://claude.ai/code/session_012BwrUiCYr6ApYk5hmXyh4o
</commit_message>
<xml_diff>
--- a/docs/larder-overview.docx
+++ b/docs/larder-overview.docx
@@ -21,7 +21,7 @@
         <w:tc>
           <w:tcPr>
             <w:tcW w:type="dxa" w:w="10080"/>
-            <w:shd w:fill="2A211B" w:val="clear"/>
+            <w:shd w:fill="26402C" w:val="clear"/>
             <w:tcMar>
               <w:top w:type="dxa" w:w="2200"/>
               <w:left w:type="dxa" w:w="520"/>
@@ -38,7 +38,7 @@
                 <w:rFonts w:ascii="Calibri" w:cs="Calibri" w:eastAsia="Calibri" w:hAnsi="Calibri"/>
                 <w:b/>
                 <w:bCs/>
-                <w:color w:val="C99A3E"/>
+                <w:color w:val="E3A94A"/>
                 <w:spacing w:val="32"/>
                 <w:sz w:val="19"/>
                 <w:szCs w:val="19"/>
@@ -123,7 +123,7 @@
           <w:rFonts w:ascii="Calibri" w:cs="Calibri" w:eastAsia="Calibri" w:hAnsi="Calibri"/>
           <w:b/>
           <w:bCs/>
-          <w:color w:val="B5651D"/>
+          <w:color w:val="C6821E"/>
           <w:spacing w:val="26"/>
           <w:sz w:val="17"/>
           <w:szCs w:val="17"/>
@@ -140,11 +140,11 @@
           <w:rFonts w:ascii="Georgia" w:cs="Georgia" w:eastAsia="Georgia" w:hAnsi="Georgia"/>
           <w:b/>
           <w:bCs/>
-          <w:color w:val="1E1B18"/>
+          <w:color w:val="1F2A1F"/>
           <w:sz w:val="38"/>
           <w:szCs w:val="38"/>
         </w:rPr>
-        <w:t xml:space="preserve">Compartir piso significa perder tiempo y dinero en la compra</w:t>
+        <w:t xml:space="preserve">La lista de la compra</w:t>
       </w:r>
     </w:p>
     <w:tbl>
@@ -195,12 +195,12 @@
                 <w:tcPr>
                   <w:tcW w:type="dxa" w:w="3427"/>
                   <w:tcBorders>
-                    <w:top w:val="single" w:color="2A211B" w:sz="4"/>
-                    <w:left w:val="single" w:color="2A211B" w:sz="4"/>
-                    <w:bottom w:val="single" w:color="2A211B" w:sz="4"/>
-                    <w:right w:val="single" w:color="2A211B" w:sz="4"/>
+                    <w:top w:val="single" w:color="26402C" w:sz="4"/>
+                    <w:left w:val="single" w:color="26402C" w:sz="4"/>
+                    <w:bottom w:val="single" w:color="26402C" w:sz="4"/>
+                    <w:right w:val="single" w:color="26402C" w:sz="4"/>
                   </w:tcBorders>
-                  <w:shd w:fill="2A211B" w:val="clear"/>
+                  <w:shd w:fill="26402C" w:val="clear"/>
                   <w:tcMar>
                     <w:top w:type="dxa" w:w="220"/>
                     <w:left w:type="dxa" w:w="220"/>
@@ -218,7 +218,7 @@
                       <w:rFonts w:ascii="Georgia" w:cs="Georgia" w:eastAsia="Georgia" w:hAnsi="Georgia"/>
                       <w:b/>
                       <w:bCs/>
-                      <w:color w:val="C99A3E"/>
+                      <w:color w:val="E3A94A"/>
                       <w:sz w:val="34"/>
                       <w:szCs w:val="34"/>
                     </w:rPr>
@@ -243,12 +243,12 @@
                 <w:tcPr>
                   <w:tcW w:type="dxa" w:w="3427"/>
                   <w:tcBorders>
-                    <w:top w:val="single" w:color="DDD3C7" w:sz="4"/>
-                    <w:left w:val="single" w:color="DDD3C7" w:sz="4"/>
-                    <w:bottom w:val="single" w:color="DDD3C7" w:sz="4"/>
-                    <w:right w:val="single" w:color="DDD3C7" w:sz="4"/>
+                    <w:top w:val="single" w:color="D6DED2" w:sz="4"/>
+                    <w:left w:val="single" w:color="D6DED2" w:sz="4"/>
+                    <w:bottom w:val="single" w:color="D6DED2" w:sz="4"/>
+                    <w:right w:val="single" w:color="D6DED2" w:sz="4"/>
                   </w:tcBorders>
-                  <w:shd w:fill="F4E9DA" w:val="clear"/>
+                  <w:shd w:fill="F2EFE7" w:val="clear"/>
                   <w:tcMar>
                     <w:top w:type="dxa" w:w="220"/>
                     <w:left w:type="dxa" w:w="220"/>
@@ -266,7 +266,7 @@
                       <w:rFonts w:ascii="Georgia" w:cs="Georgia" w:eastAsia="Georgia" w:hAnsi="Georgia"/>
                       <w:b/>
                       <w:bCs/>
-                      <w:color w:val="B5651D"/>
+                      <w:color w:val="C6821E"/>
                       <w:sz w:val="34"/>
                       <w:szCs w:val="34"/>
                     </w:rPr>
@@ -277,7 +277,7 @@
                   <w:r>
                     <w:rPr>
                       <w:rFonts w:ascii="Calibri" w:cs="Calibri" w:eastAsia="Calibri" w:hAnsi="Calibri"/>
-                      <w:color w:val="857A6E"/>
+                      <w:color w:val="5B6559"/>
                       <w:sz w:val="17"/>
                       <w:szCs w:val="17"/>
                     </w:rPr>
@@ -291,12 +291,12 @@
                 <w:tcPr>
                   <w:tcW w:type="dxa" w:w="3427"/>
                   <w:tcBorders>
-                    <w:top w:val="single" w:color="DDD3C7" w:sz="4"/>
-                    <w:left w:val="single" w:color="DDD3C7" w:sz="4"/>
-                    <w:bottom w:val="single" w:color="DDD3C7" w:sz="4"/>
-                    <w:right w:val="single" w:color="DDD3C7" w:sz="4"/>
+                    <w:top w:val="single" w:color="D6DED2" w:sz="4"/>
+                    <w:left w:val="single" w:color="D6DED2" w:sz="4"/>
+                    <w:bottom w:val="single" w:color="D6DED2" w:sz="4"/>
+                    <w:right w:val="single" w:color="D6DED2" w:sz="4"/>
                   </w:tcBorders>
-                  <w:shd w:fill="F4E9DA" w:val="clear"/>
+                  <w:shd w:fill="F2EFE7" w:val="clear"/>
                   <w:tcMar>
                     <w:top w:type="dxa" w:w="220"/>
                     <w:left w:type="dxa" w:w="220"/>
@@ -314,7 +314,7 @@
                       <w:rFonts w:ascii="Georgia" w:cs="Georgia" w:eastAsia="Georgia" w:hAnsi="Georgia"/>
                       <w:b/>
                       <w:bCs/>
-                      <w:color w:val="B5651D"/>
+                      <w:color w:val="C6821E"/>
                       <w:sz w:val="34"/>
                       <w:szCs w:val="34"/>
                     </w:rPr>
@@ -325,7 +325,7 @@
                   <w:r>
                     <w:rPr>
                       <w:rFonts w:ascii="Calibri" w:cs="Calibri" w:eastAsia="Calibri" w:hAnsi="Calibri"/>
-                      <w:color w:val="857A6E"/>
+                      <w:color w:val="5B6559"/>
                       <w:sz w:val="17"/>
                       <w:szCs w:val="17"/>
                     </w:rPr>
@@ -367,7 +367,7 @@
             <w:r>
               <w:rPr>
                 <w:rFonts w:ascii="Calibri" w:cs="Calibri" w:eastAsia="Calibri" w:hAnsi="Calibri"/>
-                <w:color w:val="1E1B18"/>
+                <w:color w:val="1F2A1F"/>
                 <w:sz w:val="21"/>
                 <w:szCs w:val="21"/>
               </w:rPr>
@@ -381,7 +381,7 @@
             <w:r>
               <w:rPr>
                 <w:rFonts w:ascii="Calibri" w:cs="Calibri" w:eastAsia="Calibri" w:hAnsi="Calibri"/>
-                <w:color w:val="1E1B18"/>
+                <w:color w:val="1F2A1F"/>
                 <w:sz w:val="21"/>
                 <w:szCs w:val="21"/>
               </w:rPr>
@@ -397,7 +397,7 @@
                 <w:rFonts w:ascii="Calibri" w:cs="Calibri" w:eastAsia="Calibri" w:hAnsi="Calibri"/>
                 <w:i/>
                 <w:iCs/>
-                <w:color w:val="857A6E"/>
+                <w:color w:val="5B6559"/>
                 <w:sz w:val="19"/>
                 <w:szCs w:val="19"/>
               </w:rPr>
@@ -421,7 +421,7 @@
           <w:rFonts w:ascii="Calibri" w:cs="Calibri" w:eastAsia="Calibri" w:hAnsi="Calibri"/>
           <w:b/>
           <w:bCs/>
-          <w:color w:val="B5651D"/>
+          <w:color w:val="C6821E"/>
           <w:spacing w:val="26"/>
           <w:sz w:val="17"/>
           <w:szCs w:val="17"/>
@@ -438,7 +438,7 @@
           <w:rFonts w:ascii="Georgia" w:cs="Georgia" w:eastAsia="Georgia" w:hAnsi="Georgia"/>
           <w:b/>
           <w:bCs/>
-          <w:color w:val="1E1B18"/>
+          <w:color w:val="1F2A1F"/>
           <w:sz w:val="38"/>
           <w:szCs w:val="38"/>
         </w:rPr>
@@ -466,12 +466,12 @@
           <w:tcPr>
             <w:tcW w:type="dxa" w:w="5040"/>
             <w:tcBorders>
-              <w:top w:val="single" w:color="2A211B" w:sz="4"/>
-              <w:left w:val="single" w:color="2A211B" w:sz="4"/>
-              <w:bottom w:val="single" w:color="2A211B" w:sz="4"/>
-              <w:right w:val="single" w:color="2A211B" w:sz="4"/>
-            </w:tcBorders>
-            <w:shd w:fill="2A211B" w:val="clear"/>
+              <w:top w:val="single" w:color="26402C" w:sz="4"/>
+              <w:left w:val="single" w:color="26402C" w:sz="4"/>
+              <w:bottom w:val="single" w:color="26402C" w:sz="4"/>
+              <w:right w:val="single" w:color="26402C" w:sz="4"/>
+            </w:tcBorders>
+            <w:shd w:fill="26402C" w:val="clear"/>
             <w:tcMar>
               <w:top w:type="dxa" w:w="220"/>
               <w:left w:type="dxa" w:w="220"/>
@@ -489,7 +489,7 @@
                 <w:rFonts w:ascii="Georgia" w:cs="Georgia" w:eastAsia="Georgia" w:hAnsi="Georgia"/>
                 <w:b/>
                 <w:bCs/>
-                <w:color w:val="C99A3E"/>
+                <w:color w:val="E3A94A"/>
                 <w:sz w:val="34"/>
                 <w:szCs w:val="34"/>
               </w:rPr>
@@ -512,12 +512,12 @@
           <w:tcPr>
             <w:tcW w:type="dxa" w:w="5040"/>
             <w:tcBorders>
-              <w:top w:val="single" w:color="DDD3C7" w:sz="4"/>
-              <w:left w:val="single" w:color="DDD3C7" w:sz="4"/>
-              <w:bottom w:val="single" w:color="DDD3C7" w:sz="4"/>
-              <w:right w:val="single" w:color="DDD3C7" w:sz="4"/>
-            </w:tcBorders>
-            <w:shd w:fill="F4E9DA" w:val="clear"/>
+              <w:top w:val="single" w:color="D6DED2" w:sz="4"/>
+              <w:left w:val="single" w:color="D6DED2" w:sz="4"/>
+              <w:bottom w:val="single" w:color="D6DED2" w:sz="4"/>
+              <w:right w:val="single" w:color="D6DED2" w:sz="4"/>
+            </w:tcBorders>
+            <w:shd w:fill="F2EFE7" w:val="clear"/>
             <w:tcMar>
               <w:top w:type="dxa" w:w="220"/>
               <w:left w:type="dxa" w:w="220"/>
@@ -535,7 +535,7 @@
                 <w:rFonts w:ascii="Georgia" w:cs="Georgia" w:eastAsia="Georgia" w:hAnsi="Georgia"/>
                 <w:b/>
                 <w:bCs/>
-                <w:color w:val="B5651D"/>
+                <w:color w:val="C6821E"/>
                 <w:sz w:val="34"/>
                 <w:szCs w:val="34"/>
               </w:rPr>
@@ -546,7 +546,7 @@
             <w:r>
               <w:rPr>
                 <w:rFonts w:ascii="Calibri" w:cs="Calibri" w:eastAsia="Calibri" w:hAnsi="Calibri"/>
-                <w:color w:val="857A6E"/>
+                <w:color w:val="5B6559"/>
                 <w:sz w:val="17"/>
                 <w:szCs w:val="17"/>
               </w:rPr>
@@ -568,7 +568,7 @@
       <w:r>
         <w:rPr>
           <w:rFonts w:ascii="Calibri" w:cs="Calibri" w:eastAsia="Calibri" w:hAnsi="Calibri"/>
-          <w:color w:val="1E1B18"/>
+          <w:color w:val="1F2A1F"/>
           <w:sz w:val="21"/>
           <w:szCs w:val="21"/>
         </w:rPr>
@@ -599,12 +599,12 @@
           <w:tcPr>
             <w:tcW w:type="dxa" w:w="2822"/>
             <w:tcBorders>
-              <w:top w:val="single" w:color="2A211B" w:sz="4"/>
-              <w:left w:val="single" w:color="2A211B" w:sz="4"/>
-              <w:bottom w:val="single" w:color="2A211B" w:sz="4"/>
-              <w:right w:val="single" w:color="2A211B" w:sz="4"/>
-            </w:tcBorders>
-            <w:shd w:fill="2A211B" w:val="clear"/>
+              <w:top w:val="single" w:color="26402C" w:sz="4"/>
+              <w:left w:val="single" w:color="26402C" w:sz="4"/>
+              <w:bottom w:val="single" w:color="26402C" w:sz="4"/>
+              <w:right w:val="single" w:color="26402C" w:sz="4"/>
+            </w:tcBorders>
+            <w:shd w:fill="26402C" w:val="clear"/>
             <w:tcMar>
               <w:top w:type="dxa" w:w="130"/>
               <w:left w:type="dxa" w:w="160"/>
@@ -631,12 +631,12 @@
           <w:tcPr>
             <w:tcW w:type="dxa" w:w="7257"/>
             <w:tcBorders>
-              <w:top w:val="single" w:color="2A211B" w:sz="4"/>
-              <w:left w:val="single" w:color="2A211B" w:sz="4"/>
-              <w:bottom w:val="single" w:color="2A211B" w:sz="4"/>
-              <w:right w:val="single" w:color="2A211B" w:sz="4"/>
-            </w:tcBorders>
-            <w:shd w:fill="2A211B" w:val="clear"/>
+              <w:top w:val="single" w:color="26402C" w:sz="4"/>
+              <w:left w:val="single" w:color="26402C" w:sz="4"/>
+              <w:bottom w:val="single" w:color="26402C" w:sz="4"/>
+              <w:right w:val="single" w:color="26402C" w:sz="4"/>
+            </w:tcBorders>
+            <w:shd w:fill="26402C" w:val="clear"/>
             <w:tcMar>
               <w:top w:type="dxa" w:w="130"/>
               <w:left w:type="dxa" w:w="160"/>
@@ -665,10 +665,10 @@
           <w:tcPr>
             <w:tcW w:type="dxa" w:w="2822"/>
             <w:tcBorders>
-              <w:top w:val="single" w:color="DDD3C7" w:sz="4"/>
-              <w:left w:val="single" w:color="DDD3C7" w:sz="4"/>
-              <w:bottom w:val="single" w:color="DDD3C7" w:sz="4"/>
-              <w:right w:val="single" w:color="DDD3C7" w:sz="4"/>
+              <w:top w:val="single" w:color="D6DED2" w:sz="4"/>
+              <w:left w:val="single" w:color="D6DED2" w:sz="4"/>
+              <w:bottom w:val="single" w:color="D6DED2" w:sz="4"/>
+              <w:right w:val="single" w:color="D6DED2" w:sz="4"/>
             </w:tcBorders>
             <w:shd w:fill="FFFFFF" w:val="clear"/>
             <w:tcMar>
@@ -683,7 +683,7 @@
             <w:r>
               <w:rPr>
                 <w:rFonts w:ascii="Calibri" w:cs="Calibri" w:eastAsia="Calibri" w:hAnsi="Calibri"/>
-                <w:color w:val="1E1B18"/>
+                <w:color w:val="1F2A1F"/>
                 <w:sz w:val="18"/>
                 <w:szCs w:val="18"/>
               </w:rPr>
@@ -695,10 +695,10 @@
           <w:tcPr>
             <w:tcW w:type="dxa" w:w="7257"/>
             <w:tcBorders>
-              <w:top w:val="single" w:color="DDD3C7" w:sz="4"/>
-              <w:left w:val="single" w:color="DDD3C7" w:sz="4"/>
-              <w:bottom w:val="single" w:color="DDD3C7" w:sz="4"/>
-              <w:right w:val="single" w:color="DDD3C7" w:sz="4"/>
+              <w:top w:val="single" w:color="D6DED2" w:sz="4"/>
+              <w:left w:val="single" w:color="D6DED2" w:sz="4"/>
+              <w:bottom w:val="single" w:color="D6DED2" w:sz="4"/>
+              <w:right w:val="single" w:color="D6DED2" w:sz="4"/>
             </w:tcBorders>
             <w:shd w:fill="FFFFFF" w:val="clear"/>
             <w:tcMar>
@@ -713,7 +713,7 @@
             <w:r>
               <w:rPr>
                 <w:rFonts w:ascii="Calibri" w:cs="Calibri" w:eastAsia="Calibri" w:hAnsi="Calibri"/>
-                <w:color w:val="1E1B18"/>
+                <w:color w:val="1F2A1F"/>
                 <w:sz w:val="18"/>
                 <w:szCs w:val="18"/>
               </w:rPr>
@@ -727,12 +727,12 @@
           <w:tcPr>
             <w:tcW w:type="dxa" w:w="2822"/>
             <w:tcBorders>
-              <w:top w:val="single" w:color="DDD3C7" w:sz="4"/>
-              <w:left w:val="single" w:color="DDD3C7" w:sz="4"/>
-              <w:bottom w:val="single" w:color="DDD3C7" w:sz="4"/>
-              <w:right w:val="single" w:color="DDD3C7" w:sz="4"/>
-            </w:tcBorders>
-            <w:shd w:fill="F4E9DA" w:val="clear"/>
+              <w:top w:val="single" w:color="D6DED2" w:sz="4"/>
+              <w:left w:val="single" w:color="D6DED2" w:sz="4"/>
+              <w:bottom w:val="single" w:color="D6DED2" w:sz="4"/>
+              <w:right w:val="single" w:color="D6DED2" w:sz="4"/>
+            </w:tcBorders>
+            <w:shd w:fill="F2EFE7" w:val="clear"/>
             <w:tcMar>
               <w:top w:type="dxa" w:w="130"/>
               <w:left w:type="dxa" w:w="160"/>
@@ -745,7 +745,7 @@
             <w:r>
               <w:rPr>
                 <w:rFonts w:ascii="Calibri" w:cs="Calibri" w:eastAsia="Calibri" w:hAnsi="Calibri"/>
-                <w:color w:val="1E1B18"/>
+                <w:color w:val="1F2A1F"/>
                 <w:sz w:val="18"/>
                 <w:szCs w:val="18"/>
               </w:rPr>
@@ -757,12 +757,12 @@
           <w:tcPr>
             <w:tcW w:type="dxa" w:w="7257"/>
             <w:tcBorders>
-              <w:top w:val="single" w:color="DDD3C7" w:sz="4"/>
-              <w:left w:val="single" w:color="DDD3C7" w:sz="4"/>
-              <w:bottom w:val="single" w:color="DDD3C7" w:sz="4"/>
-              <w:right w:val="single" w:color="DDD3C7" w:sz="4"/>
-            </w:tcBorders>
-            <w:shd w:fill="F4E9DA" w:val="clear"/>
+              <w:top w:val="single" w:color="D6DED2" w:sz="4"/>
+              <w:left w:val="single" w:color="D6DED2" w:sz="4"/>
+              <w:bottom w:val="single" w:color="D6DED2" w:sz="4"/>
+              <w:right w:val="single" w:color="D6DED2" w:sz="4"/>
+            </w:tcBorders>
+            <w:shd w:fill="F2EFE7" w:val="clear"/>
             <w:tcMar>
               <w:top w:type="dxa" w:w="130"/>
               <w:left w:type="dxa" w:w="160"/>
@@ -775,7 +775,7 @@
             <w:r>
               <w:rPr>
                 <w:rFonts w:ascii="Calibri" w:cs="Calibri" w:eastAsia="Calibri" w:hAnsi="Calibri"/>
-                <w:color w:val="1E1B18"/>
+                <w:color w:val="1F2A1F"/>
                 <w:sz w:val="18"/>
                 <w:szCs w:val="18"/>
               </w:rPr>
@@ -789,10 +789,10 @@
           <w:tcPr>
             <w:tcW w:type="dxa" w:w="2822"/>
             <w:tcBorders>
-              <w:top w:val="single" w:color="DDD3C7" w:sz="4"/>
-              <w:left w:val="single" w:color="DDD3C7" w:sz="4"/>
-              <w:bottom w:val="single" w:color="DDD3C7" w:sz="4"/>
-              <w:right w:val="single" w:color="DDD3C7" w:sz="4"/>
+              <w:top w:val="single" w:color="D6DED2" w:sz="4"/>
+              <w:left w:val="single" w:color="D6DED2" w:sz="4"/>
+              <w:bottom w:val="single" w:color="D6DED2" w:sz="4"/>
+              <w:right w:val="single" w:color="D6DED2" w:sz="4"/>
             </w:tcBorders>
             <w:shd w:fill="FFFFFF" w:val="clear"/>
             <w:tcMar>
@@ -807,11 +807,11 @@
             <w:r>
               <w:rPr>
                 <w:rFonts w:ascii="Calibri" w:cs="Calibri" w:eastAsia="Calibri" w:hAnsi="Calibri"/>
-                <w:color w:val="1E1B18"/>
-                <w:sz w:val="18"/>
-                <w:szCs w:val="18"/>
-              </w:rPr>
-              <w:t xml:space="preserve">Bring!</w:t>
+                <w:color w:val="1F2A1F"/>
+                <w:sz w:val="18"/>
+                <w:szCs w:val="18"/>
+              </w:rPr>
+              <w:t xml:space="preserve">Bring! — 4.7★ App Store</w:t>
             </w:r>
           </w:p>
         </w:tc>
@@ -819,10 +819,10 @@
           <w:tcPr>
             <w:tcW w:type="dxa" w:w="7257"/>
             <w:tcBorders>
-              <w:top w:val="single" w:color="DDD3C7" w:sz="4"/>
-              <w:left w:val="single" w:color="DDD3C7" w:sz="4"/>
-              <w:bottom w:val="single" w:color="DDD3C7" w:sz="4"/>
-              <w:right w:val="single" w:color="DDD3C7" w:sz="4"/>
+              <w:top w:val="single" w:color="D6DED2" w:sz="4"/>
+              <w:left w:val="single" w:color="D6DED2" w:sz="4"/>
+              <w:bottom w:val="single" w:color="D6DED2" w:sz="4"/>
+              <w:right w:val="single" w:color="D6DED2" w:sz="4"/>
             </w:tcBorders>
             <w:shd w:fill="FFFFFF" w:val="clear"/>
             <w:tcMar>
@@ -837,7 +837,7 @@
             <w:r>
               <w:rPr>
                 <w:rFonts w:ascii="Calibri" w:cs="Calibri" w:eastAsia="Calibri" w:hAnsi="Calibri"/>
-                <w:color w:val="1E1B18"/>
+                <w:color w:val="1F2A1F"/>
                 <w:sz w:val="18"/>
                 <w:szCs w:val="18"/>
               </w:rPr>
@@ -851,12 +851,12 @@
           <w:tcPr>
             <w:tcW w:type="dxa" w:w="2822"/>
             <w:tcBorders>
-              <w:top w:val="single" w:color="DDD3C7" w:sz="4"/>
-              <w:left w:val="single" w:color="DDD3C7" w:sz="4"/>
-              <w:bottom w:val="single" w:color="DDD3C7" w:sz="4"/>
-              <w:right w:val="single" w:color="DDD3C7" w:sz="4"/>
-            </w:tcBorders>
-            <w:shd w:fill="F4E9DA" w:val="clear"/>
+              <w:top w:val="single" w:color="D6DED2" w:sz="4"/>
+              <w:left w:val="single" w:color="D6DED2" w:sz="4"/>
+              <w:bottom w:val="single" w:color="D6DED2" w:sz="4"/>
+              <w:right w:val="single" w:color="D6DED2" w:sz="4"/>
+            </w:tcBorders>
+            <w:shd w:fill="F2EFE7" w:val="clear"/>
             <w:tcMar>
               <w:top w:type="dxa" w:w="130"/>
               <w:left w:type="dxa" w:w="160"/>
@@ -869,11 +869,11 @@
             <w:r>
               <w:rPr>
                 <w:rFonts w:ascii="Calibri" w:cs="Calibri" w:eastAsia="Calibri" w:hAnsi="Calibri"/>
-                <w:color w:val="1E1B18"/>
-                <w:sz w:val="18"/>
-                <w:szCs w:val="18"/>
-              </w:rPr>
-              <w:t xml:space="preserve">AnyList</w:t>
+                <w:color w:val="1F2A1F"/>
+                <w:sz w:val="18"/>
+                <w:szCs w:val="18"/>
+              </w:rPr>
+              <w:t xml:space="preserve">AnyList — 4.6★ App Store</w:t>
             </w:r>
           </w:p>
         </w:tc>
@@ -881,12 +881,12 @@
           <w:tcPr>
             <w:tcW w:type="dxa" w:w="7257"/>
             <w:tcBorders>
-              <w:top w:val="single" w:color="DDD3C7" w:sz="4"/>
-              <w:left w:val="single" w:color="DDD3C7" w:sz="4"/>
-              <w:bottom w:val="single" w:color="DDD3C7" w:sz="4"/>
-              <w:right w:val="single" w:color="DDD3C7" w:sz="4"/>
-            </w:tcBorders>
-            <w:shd w:fill="F4E9DA" w:val="clear"/>
+              <w:top w:val="single" w:color="D6DED2" w:sz="4"/>
+              <w:left w:val="single" w:color="D6DED2" w:sz="4"/>
+              <w:bottom w:val="single" w:color="D6DED2" w:sz="4"/>
+              <w:right w:val="single" w:color="D6DED2" w:sz="4"/>
+            </w:tcBorders>
+            <w:shd w:fill="F2EFE7" w:val="clear"/>
             <w:tcMar>
               <w:top w:type="dxa" w:w="130"/>
               <w:left w:type="dxa" w:w="160"/>
@@ -899,7 +899,7 @@
             <w:r>
               <w:rPr>
                 <w:rFonts w:ascii="Calibri" w:cs="Calibri" w:eastAsia="Calibri" w:hAnsi="Calibri"/>
-                <w:color w:val="1E1B18"/>
+                <w:color w:val="1F2A1F"/>
                 <w:sz w:val="18"/>
                 <w:szCs w:val="18"/>
               </w:rPr>
@@ -935,11 +935,11 @@
             <w:tcW w:type="dxa" w:w="10080"/>
             <w:tcBorders>
               <w:top w:val="none" w:color="FFFFFF" w:sz="0"/>
-              <w:left w:val="single" w:color="B5651D" w:sz="24"/>
+              <w:left w:val="single" w:color="C6821E" w:sz="24"/>
               <w:bottom w:val="none" w:color="FFFFFF" w:sz="0"/>
               <w:right w:val="none" w:color="FFFFFF" w:sz="0"/>
             </w:tcBorders>
-            <w:shd w:fill="ECE1D2" w:val="clear"/>
+            <w:shd w:fill="E9E4D6" w:val="clear"/>
             <w:tcMar>
               <w:top w:type="dxa" w:w="200"/>
               <w:left w:type="dxa" w:w="280"/>
@@ -953,7 +953,7 @@
                 <w:rFonts w:ascii="Georgia" w:cs="Georgia" w:eastAsia="Georgia" w:hAnsi="Georgia"/>
                 <w:i/>
                 <w:iCs/>
-                <w:color w:val="1E1B18"/>
+                <w:color w:val="1F2A1F"/>
                 <w:sz w:val="25"/>
                 <w:szCs w:val="25"/>
               </w:rPr>
@@ -977,7 +977,7 @@
           <w:rFonts w:ascii="Calibri" w:cs="Calibri" w:eastAsia="Calibri" w:hAnsi="Calibri"/>
           <w:b/>
           <w:bCs/>
-          <w:color w:val="B5651D"/>
+          <w:color w:val="C6821E"/>
           <w:spacing w:val="26"/>
           <w:sz w:val="17"/>
           <w:szCs w:val="17"/>
@@ -994,7 +994,7 @@
           <w:rFonts w:ascii="Georgia" w:cs="Georgia" w:eastAsia="Georgia" w:hAnsi="Georgia"/>
           <w:b/>
           <w:bCs/>
-          <w:color w:val="1E1B18"/>
+          <w:color w:val="1F2A1F"/>
           <w:sz w:val="38"/>
           <w:szCs w:val="38"/>
         </w:rPr>
@@ -1008,7 +1008,7 @@
       <w:r>
         <w:rPr>
           <w:rFonts w:ascii="Calibri" w:cs="Calibri" w:eastAsia="Calibri" w:hAnsi="Calibri"/>
-          <w:color w:val="1E1B18"/>
+          <w:color w:val="1F2A1F"/>
           <w:sz w:val="21"/>
           <w:szCs w:val="21"/>
         </w:rPr>
@@ -1041,12 +1041,12 @@
           <w:tcPr>
             <w:tcW w:type="dxa" w:w="4960"/>
             <w:tcBorders>
-              <w:top w:val="single" w:color="DDD3C7" w:sz="4"/>
-              <w:left w:val="single" w:color="DDD3C7" w:sz="4"/>
-              <w:bottom w:val="single" w:color="DDD3C7" w:sz="4"/>
-              <w:right w:val="single" w:color="DDD3C7" w:sz="4"/>
-            </w:tcBorders>
-            <w:shd w:fill="F4E9DA" w:val="clear"/>
+              <w:top w:val="single" w:color="D6DED2" w:sz="4"/>
+              <w:left w:val="single" w:color="D6DED2" w:sz="4"/>
+              <w:bottom w:val="single" w:color="D6DED2" w:sz="4"/>
+              <w:right w:val="single" w:color="D6DED2" w:sz="4"/>
+            </w:tcBorders>
+            <w:shd w:fill="F2EFE7" w:val="clear"/>
             <w:tcMar>
               <w:top w:type="dxa" w:w="240"/>
               <w:left w:type="dxa" w:w="240"/>
@@ -1064,7 +1064,7 @@
                 <w:rFonts w:ascii="Georgia" w:cs="Georgia" w:eastAsia="Georgia" w:hAnsi="Georgia"/>
                 <w:b/>
                 <w:bCs/>
-                <w:color w:val="B5651D"/>
+                <w:color w:val="C6821E"/>
                 <w:sz w:val="30"/>
                 <w:szCs w:val="30"/>
               </w:rPr>
@@ -1080,7 +1080,7 @@
                 <w:rFonts w:ascii="Calibri" w:cs="Calibri" w:eastAsia="Calibri" w:hAnsi="Calibri"/>
                 <w:b/>
                 <w:bCs/>
-                <w:color w:val="1E1B18"/>
+                <w:color w:val="1F2A1F"/>
                 <w:sz w:val="21"/>
                 <w:szCs w:val="21"/>
               </w:rPr>
@@ -1091,7 +1091,7 @@
             <w:r>
               <w:rPr>
                 <w:rFonts w:ascii="Calibri" w:cs="Calibri" w:eastAsia="Calibri" w:hAnsi="Calibri"/>
-                <w:color w:val="857A6E"/>
+                <w:color w:val="5B6559"/>
                 <w:sz w:val="19"/>
                 <w:szCs w:val="19"/>
               </w:rPr>
@@ -1103,12 +1103,12 @@
           <w:tcPr>
             <w:tcW w:type="dxa" w:w="4960"/>
             <w:tcBorders>
-              <w:top w:val="single" w:color="DDD3C7" w:sz="4"/>
-              <w:left w:val="single" w:color="DDD3C7" w:sz="4"/>
-              <w:bottom w:val="single" w:color="DDD3C7" w:sz="4"/>
-              <w:right w:val="single" w:color="DDD3C7" w:sz="4"/>
-            </w:tcBorders>
-            <w:shd w:fill="ECE1D2" w:val="clear"/>
+              <w:top w:val="single" w:color="D6DED2" w:sz="4"/>
+              <w:left w:val="single" w:color="D6DED2" w:sz="4"/>
+              <w:bottom w:val="single" w:color="D6DED2" w:sz="4"/>
+              <w:right w:val="single" w:color="D6DED2" w:sz="4"/>
+            </w:tcBorders>
+            <w:shd w:fill="E9E4D6" w:val="clear"/>
             <w:tcMar>
               <w:top w:type="dxa" w:w="240"/>
               <w:left w:type="dxa" w:w="240"/>
@@ -1126,7 +1126,7 @@
                 <w:rFonts w:ascii="Georgia" w:cs="Georgia" w:eastAsia="Georgia" w:hAnsi="Georgia"/>
                 <w:b/>
                 <w:bCs/>
-                <w:color w:val="B5651D"/>
+                <w:color w:val="C6821E"/>
                 <w:sz w:val="30"/>
                 <w:szCs w:val="30"/>
               </w:rPr>
@@ -1142,22 +1142,22 @@
                 <w:rFonts w:ascii="Calibri" w:cs="Calibri" w:eastAsia="Calibri" w:hAnsi="Calibri"/>
                 <w:b/>
                 <w:bCs/>
-                <w:color w:val="1E1B18"/>
+                <w:color w:val="1F2A1F"/>
                 <w:sz w:val="21"/>
                 <w:szCs w:val="21"/>
               </w:rPr>
-              <w:t xml:space="preserve">Lista automática</w:t>
-            </w:r>
-          </w:p>
-          <w:p>
-            <w:r>
-              <w:rPr>
-                <w:rFonts w:ascii="Calibri" w:cs="Calibri" w:eastAsia="Calibri" w:hAnsi="Calibri"/>
-                <w:color w:val="857A6E"/>
+              <w:t xml:space="preserve">List</w:t>
+            </w:r>
+          </w:p>
+          <w:p>
+            <w:r>
+              <w:rPr>
+                <w:rFonts w:ascii="Calibri" w:cs="Calibri" w:eastAsia="Calibri" w:hAnsi="Calibri"/>
+                <w:color w:val="5B6559"/>
                 <w:sz w:val="19"/>
                 <w:szCs w:val="19"/>
               </w:rPr>
-              <w:t xml:space="preserve">En cuanto algo se marca "se acabó", entra solo en la lista de la compra del hogar — nadie tiene que apuntarlo.</w:t>
+              <w:t xml:space="preserve">Sacando una foto al ticket de la compra, la lista se genera sola — sin teclear nada.</w:t>
             </w:r>
           </w:p>
         </w:tc>
@@ -1167,12 +1167,12 @@
           <w:tcPr>
             <w:tcW w:type="dxa" w:w="4960"/>
             <w:tcBorders>
-              <w:top w:val="single" w:color="DDD3C7" w:sz="4"/>
-              <w:left w:val="single" w:color="DDD3C7" w:sz="4"/>
-              <w:bottom w:val="single" w:color="DDD3C7" w:sz="4"/>
-              <w:right w:val="single" w:color="DDD3C7" w:sz="4"/>
-            </w:tcBorders>
-            <w:shd w:fill="ECE1D2" w:val="clear"/>
+              <w:top w:val="single" w:color="D6DED2" w:sz="4"/>
+              <w:left w:val="single" w:color="D6DED2" w:sz="4"/>
+              <w:bottom w:val="single" w:color="D6DED2" w:sz="4"/>
+              <w:right w:val="single" w:color="D6DED2" w:sz="4"/>
+            </w:tcBorders>
+            <w:shd w:fill="E9E4D6" w:val="clear"/>
             <w:tcMar>
               <w:top w:type="dxa" w:w="240"/>
               <w:left w:type="dxa" w:w="240"/>
@@ -1190,7 +1190,7 @@
                 <w:rFonts w:ascii="Georgia" w:cs="Georgia" w:eastAsia="Georgia" w:hAnsi="Georgia"/>
                 <w:b/>
                 <w:bCs/>
-                <w:color w:val="B5651D"/>
+                <w:color w:val="C6821E"/>
                 <w:sz w:val="30"/>
                 <w:szCs w:val="30"/>
               </w:rPr>
@@ -1206,7 +1206,7 @@
                 <w:rFonts w:ascii="Calibri" w:cs="Calibri" w:eastAsia="Calibri" w:hAnsi="Calibri"/>
                 <w:b/>
                 <w:bCs/>
-                <w:color w:val="1E1B18"/>
+                <w:color w:val="1F2A1F"/>
                 <w:sz w:val="21"/>
                 <w:szCs w:val="21"/>
               </w:rPr>
@@ -1217,11 +1217,11 @@
             <w:r>
               <w:rPr>
                 <w:rFonts w:ascii="Calibri" w:cs="Calibri" w:eastAsia="Calibri" w:hAnsi="Calibri"/>
-                <w:color w:val="857A6E"/>
+                <w:color w:val="5B6559"/>
                 <w:sz w:val="19"/>
                 <w:szCs w:val="19"/>
               </w:rPr>
-              <w:t xml:space="preserve">El hogar se entera por Telegram de quién le toca comprar, y marca la compra en tiempo real, sin duplicados.</w:t>
+              <w:t xml:space="preserve">Todo el piso ve al momento quién compra qué, en tiempo real, sin duplicados.</w:t>
             </w:r>
           </w:p>
         </w:tc>
@@ -1229,12 +1229,12 @@
           <w:tcPr>
             <w:tcW w:type="dxa" w:w="4960"/>
             <w:tcBorders>
-              <w:top w:val="single" w:color="DDD3C7" w:sz="4"/>
-              <w:left w:val="single" w:color="DDD3C7" w:sz="4"/>
-              <w:bottom w:val="single" w:color="DDD3C7" w:sz="4"/>
-              <w:right w:val="single" w:color="DDD3C7" w:sz="4"/>
-            </w:tcBorders>
-            <w:shd w:fill="F4E9DA" w:val="clear"/>
+              <w:top w:val="single" w:color="D6DED2" w:sz="4"/>
+              <w:left w:val="single" w:color="D6DED2" w:sz="4"/>
+              <w:bottom w:val="single" w:color="D6DED2" w:sz="4"/>
+              <w:right w:val="single" w:color="D6DED2" w:sz="4"/>
+            </w:tcBorders>
+            <w:shd w:fill="F2EFE7" w:val="clear"/>
             <w:tcMar>
               <w:top w:type="dxa" w:w="240"/>
               <w:left w:type="dxa" w:w="240"/>
@@ -1252,7 +1252,7 @@
                 <w:rFonts w:ascii="Georgia" w:cs="Georgia" w:eastAsia="Georgia" w:hAnsi="Georgia"/>
                 <w:b/>
                 <w:bCs/>
-                <w:color w:val="B5651D"/>
+                <w:color w:val="C6821E"/>
                 <w:sz w:val="30"/>
                 <w:szCs w:val="30"/>
               </w:rPr>
@@ -1268,18 +1268,18 @@
                 <w:rFonts w:ascii="Calibri" w:cs="Calibri" w:eastAsia="Calibri" w:hAnsi="Calibri"/>
                 <w:b/>
                 <w:bCs/>
-                <w:color w:val="1E1B18"/>
+                <w:color w:val="1F2A1F"/>
                 <w:sz w:val="21"/>
                 <w:szCs w:val="21"/>
               </w:rPr>
-              <w:t xml:space="preserve">Historial y precios</w:t>
-            </w:r>
-          </w:p>
-          <w:p>
-            <w:r>
-              <w:rPr>
-                <w:rFonts w:ascii="Calibri" w:cs="Calibri" w:eastAsia="Calibri" w:hAnsi="Calibri"/>
-                <w:color w:val="857A6E"/>
+              <w:t xml:space="preserve">History / Prices</w:t>
+            </w:r>
+          </w:p>
+          <w:p>
+            <w:r>
+              <w:rPr>
+                <w:rFonts w:ascii="Calibri" w:cs="Calibri" w:eastAsia="Calibri" w:hAnsi="Calibri"/>
+                <w:color w:val="5B6559"/>
                 <w:sz w:val="19"/>
                 <w:szCs w:val="19"/>
               </w:rPr>
@@ -1313,7 +1313,7 @@
         <w:tc>
           <w:tcPr>
             <w:tcW w:type="dxa" w:w="10080"/>
-            <w:shd w:fill="2A211B" w:val="clear"/>
+            <w:shd w:fill="26402C" w:val="clear"/>
             <w:tcMar>
               <w:top w:type="dxa" w:w="220"/>
               <w:left w:type="dxa" w:w="260"/>
@@ -1327,7 +1327,7 @@
                 <w:rFonts w:ascii="Calibri" w:cs="Calibri" w:eastAsia="Calibri" w:hAnsi="Calibri"/>
                 <w:b/>
                 <w:bCs/>
-                <w:color w:val="C99A3E"/>
+                <w:color w:val="E3A94A"/>
                 <w:sz w:val="20"/>
                 <w:szCs w:val="20"/>
               </w:rPr>
@@ -1362,12 +1362,12 @@
           <w:rFonts w:ascii="Calibri" w:cs="Calibri" w:eastAsia="Calibri" w:hAnsi="Calibri"/>
           <w:b/>
           <w:bCs/>
-          <w:color w:val="B5651D"/>
+          <w:color w:val="C6821E"/>
           <w:spacing w:val="26"/>
           <w:sz w:val="17"/>
           <w:szCs w:val="17"/>
         </w:rPr>
-        <w:t xml:space="preserve">MERCADO Y VALIDACIÓN</w:t>
+        <w:t xml:space="preserve">VALIDACIÓN</w:t>
       </w:r>
     </w:p>
     <w:p>
@@ -1379,7 +1379,668 @@
           <w:rFonts w:ascii="Georgia" w:cs="Georgia" w:eastAsia="Georgia" w:hAnsi="Georgia"/>
           <w:b/>
           <w:bCs/>
-          <w:color w:val="1E1B18"/>
+          <w:color w:val="1F2A1F"/>
+          <w:sz w:val="38"/>
+          <w:szCs w:val="38"/>
+        </w:rPr>
+        <w:t xml:space="preserve">Lo que dice quien vive el problema</w:t>
+      </w:r>
+    </w:p>
+    <w:p>
+      <w:pPr>
+        <w:spacing w:after="160" w:line="310"/>
+      </w:pPr>
+      <w:r>
+        <w:rPr>
+          <w:rFonts w:ascii="Calibri" w:cs="Calibri" w:eastAsia="Calibri" w:hAnsi="Calibri"/>
+          <w:i/>
+          <w:iCs/>
+          <w:color w:val="5B6559"/>
+          <w:sz w:val="19"/>
+          <w:szCs w:val="19"/>
+        </w:rPr>
+        <w:t xml:space="preserve">Pregunta abierta de la encuesta: "¿qué es lo que más te frustra de gestionar la compra o la nevera?" — nadie vio el prototipo antes de responder.</w:t>
+      </w:r>
+    </w:p>
+    <w:p>
+      <w:pPr>
+        <w:spacing w:after="80"/>
+      </w:pPr>
+    </w:p>
+    <w:tbl>
+      <w:tblPr>
+        <w:tblW w:type="dxa" w:w="10080"/>
+        <w:tblBorders>
+          <w:top w:val="none" w:color="FFFFFF" w:sz="0"/>
+          <w:left w:val="none" w:color="FFFFFF" w:sz="0"/>
+          <w:bottom w:val="none" w:color="FFFFFF" w:sz="0"/>
+          <w:right w:val="none" w:color="FFFFFF" w:sz="0"/>
+          <w:insideH w:val="none" w:color="FFFFFF" w:sz="0"/>
+          <w:insideV w:val="none" w:color="FFFFFF" w:sz="0"/>
+        </w:tblBorders>
+      </w:tblPr>
+      <w:tblGrid>
+        <w:gridCol w:w="3024"/>
+        <w:gridCol w:w="7056"/>
+      </w:tblGrid>
+      <w:tr>
+        <w:trPr>
+          <w:tblHeader/>
+        </w:trPr>
+        <w:tc>
+          <w:tcPr>
+            <w:tcW w:type="dxa" w:w="3024"/>
+            <w:tcBorders>
+              <w:top w:val="single" w:color="26402C" w:sz="4"/>
+              <w:left w:val="single" w:color="26402C" w:sz="4"/>
+              <w:bottom w:val="single" w:color="26402C" w:sz="4"/>
+              <w:right w:val="single" w:color="26402C" w:sz="4"/>
+            </w:tcBorders>
+            <w:shd w:fill="26402C" w:val="clear"/>
+            <w:tcMar>
+              <w:top w:type="dxa" w:w="130"/>
+              <w:left w:type="dxa" w:w="160"/>
+              <w:bottom w:type="dxa" w:w="130"/>
+              <w:right w:type="dxa" w:w="160"/>
+            </w:tcMar>
+            <w:vAlign w:val="center"/>
+          </w:tcPr>
+          <w:p>
+            <w:r>
+              <w:rPr>
+                <w:rFonts w:ascii="Calibri" w:cs="Calibri" w:eastAsia="Calibri" w:hAnsi="Calibri"/>
+                <w:b/>
+                <w:bCs/>
+                <w:color w:val="FFFFFF"/>
+                <w:sz w:val="18"/>
+                <w:szCs w:val="18"/>
+              </w:rPr>
+              <w:t xml:space="preserve">Tema</w:t>
+            </w:r>
+          </w:p>
+        </w:tc>
+        <w:tc>
+          <w:tcPr>
+            <w:tcW w:type="dxa" w:w="7056"/>
+            <w:tcBorders>
+              <w:top w:val="single" w:color="26402C" w:sz="4"/>
+              <w:left w:val="single" w:color="26402C" w:sz="4"/>
+              <w:bottom w:val="single" w:color="26402C" w:sz="4"/>
+              <w:right w:val="single" w:color="26402C" w:sz="4"/>
+            </w:tcBorders>
+            <w:shd w:fill="26402C" w:val="clear"/>
+            <w:tcMar>
+              <w:top w:type="dxa" w:w="130"/>
+              <w:left w:type="dxa" w:w="160"/>
+              <w:bottom w:type="dxa" w:w="130"/>
+              <w:right w:type="dxa" w:w="160"/>
+            </w:tcMar>
+            <w:vAlign w:val="center"/>
+          </w:tcPr>
+          <w:p>
+            <w:r>
+              <w:rPr>
+                <w:rFonts w:ascii="Calibri" w:cs="Calibri" w:eastAsia="Calibri" w:hAnsi="Calibri"/>
+                <w:b/>
+                <w:bCs/>
+                <w:color w:val="FFFFFF"/>
+                <w:sz w:val="18"/>
+                <w:szCs w:val="18"/>
+              </w:rPr>
+              <w:t xml:space="preserve">Cita / dato</w:t>
+            </w:r>
+          </w:p>
+        </w:tc>
+      </w:tr>
+      <w:tr>
+        <w:tc>
+          <w:tcPr>
+            <w:tcW w:type="dxa" w:w="3024"/>
+            <w:tcBorders>
+              <w:top w:val="single" w:color="D6DED2" w:sz="4"/>
+              <w:left w:val="single" w:color="D6DED2" w:sz="4"/>
+              <w:bottom w:val="single" w:color="D6DED2" w:sz="4"/>
+              <w:right w:val="single" w:color="D6DED2" w:sz="4"/>
+            </w:tcBorders>
+            <w:shd w:fill="FFFFFF" w:val="clear"/>
+            <w:tcMar>
+              <w:top w:type="dxa" w:w="130"/>
+              <w:left w:type="dxa" w:w="160"/>
+              <w:bottom w:type="dxa" w:w="130"/>
+              <w:right w:type="dxa" w:w="160"/>
+            </w:tcMar>
+            <w:vAlign w:val="top"/>
+          </w:tcPr>
+          <w:p>
+            <w:r>
+              <w:rPr>
+                <w:rFonts w:ascii="Calibri" w:cs="Calibri" w:eastAsia="Calibri" w:hAnsi="Calibri"/>
+                <w:color w:val="1F2A1F"/>
+                <w:sz w:val="18"/>
+                <w:szCs w:val="18"/>
+              </w:rPr>
+              <w:t xml:space="preserve">Cooperación — 8/35 · 23%</w:t>
+            </w:r>
+          </w:p>
+        </w:tc>
+        <w:tc>
+          <w:tcPr>
+            <w:tcW w:type="dxa" w:w="7056"/>
+            <w:tcBorders>
+              <w:top w:val="single" w:color="D6DED2" w:sz="4"/>
+              <w:left w:val="single" w:color="D6DED2" w:sz="4"/>
+              <w:bottom w:val="single" w:color="D6DED2" w:sz="4"/>
+              <w:right w:val="single" w:color="D6DED2" w:sz="4"/>
+            </w:tcBorders>
+            <w:shd w:fill="FFFFFF" w:val="clear"/>
+            <w:tcMar>
+              <w:top w:type="dxa" w:w="130"/>
+              <w:left w:type="dxa" w:w="160"/>
+              <w:bottom w:type="dxa" w:w="130"/>
+              <w:right w:type="dxa" w:w="160"/>
+            </w:tcMar>
+            <w:vAlign w:val="top"/>
+          </w:tcPr>
+          <w:p>
+            <w:r>
+              <w:rPr>
+                <w:rFonts w:ascii="Calibri" w:cs="Calibri" w:eastAsia="Calibri" w:hAnsi="Calibri"/>
+                <w:color w:val="1F2A1F"/>
+                <w:sz w:val="18"/>
+                <w:szCs w:val="18"/>
+              </w:rPr>
+              <w:t xml:space="preserve">"No sé quién compró qué" · "People eating my food" · "Que compran cosas que no quiero" — el tema más repetido, sin que se preguntara por él.</w:t>
+            </w:r>
+          </w:p>
+        </w:tc>
+      </w:tr>
+      <w:tr>
+        <w:tc>
+          <w:tcPr>
+            <w:tcW w:type="dxa" w:w="3024"/>
+            <w:tcBorders>
+              <w:top w:val="single" w:color="D6DED2" w:sz="4"/>
+              <w:left w:val="single" w:color="D6DED2" w:sz="4"/>
+              <w:bottom w:val="single" w:color="D6DED2" w:sz="4"/>
+              <w:right w:val="single" w:color="D6DED2" w:sz="4"/>
+            </w:tcBorders>
+            <w:shd w:fill="F2EFE7" w:val="clear"/>
+            <w:tcMar>
+              <w:top w:type="dxa" w:w="130"/>
+              <w:left w:type="dxa" w:w="160"/>
+              <w:bottom w:type="dxa" w:w="130"/>
+              <w:right w:type="dxa" w:w="160"/>
+            </w:tcMar>
+            <w:vAlign w:val="top"/>
+          </w:tcPr>
+          <w:p>
+            <w:r>
+              <w:rPr>
+                <w:rFonts w:ascii="Calibri" w:cs="Calibri" w:eastAsia="Calibri" w:hAnsi="Calibri"/>
+                <w:color w:val="1F2A1F"/>
+                <w:sz w:val="18"/>
+                <w:szCs w:val="18"/>
+              </w:rPr>
+              <w:t xml:space="preserve">Tracker de gastos — 12/35 · 34%</w:t>
+            </w:r>
+          </w:p>
+        </w:tc>
+        <w:tc>
+          <w:tcPr>
+            <w:tcW w:type="dxa" w:w="7056"/>
+            <w:tcBorders>
+              <w:top w:val="single" w:color="D6DED2" w:sz="4"/>
+              <w:left w:val="single" w:color="D6DED2" w:sz="4"/>
+              <w:bottom w:val="single" w:color="D6DED2" w:sz="4"/>
+              <w:right w:val="single" w:color="D6DED2" w:sz="4"/>
+            </w:tcBorders>
+            <w:shd w:fill="F2EFE7" w:val="clear"/>
+            <w:tcMar>
+              <w:top w:type="dxa" w:w="130"/>
+              <w:left w:type="dxa" w:w="160"/>
+              <w:bottom w:type="dxa" w:w="130"/>
+              <w:right w:type="dxa" w:w="160"/>
+            </w:tcMar>
+            <w:vAlign w:val="top"/>
+          </w:tcPr>
+          <w:p>
+            <w:r>
+              <w:rPr>
+                <w:rFonts w:ascii="Calibri" w:cs="Calibri" w:eastAsia="Calibri" w:hAnsi="Calibri"/>
+                <w:color w:val="1F2A1F"/>
+                <w:sz w:val="18"/>
+                <w:szCs w:val="18"/>
+              </w:rPr>
+              <w:t xml:space="preserve">"Que la gente no participe a la hora de hacer la compra o que tarden en pagar cuando dividimos gastos" — resuelto por History.</w:t>
+            </w:r>
+          </w:p>
+        </w:tc>
+      </w:tr>
+      <w:tr>
+        <w:tc>
+          <w:tcPr>
+            <w:tcW w:type="dxa" w:w="3024"/>
+            <w:tcBorders>
+              <w:top w:val="single" w:color="D6DED2" w:sz="4"/>
+              <w:left w:val="single" w:color="D6DED2" w:sz="4"/>
+              <w:bottom w:val="single" w:color="D6DED2" w:sz="4"/>
+              <w:right w:val="single" w:color="D6DED2" w:sz="4"/>
+            </w:tcBorders>
+            <w:shd w:fill="FFFFFF" w:val="clear"/>
+            <w:tcMar>
+              <w:top w:type="dxa" w:w="130"/>
+              <w:left w:type="dxa" w:w="160"/>
+              <w:bottom w:type="dxa" w:w="130"/>
+              <w:right w:type="dxa" w:w="160"/>
+            </w:tcMar>
+            <w:vAlign w:val="top"/>
+          </w:tcPr>
+          <w:p>
+            <w:r>
+              <w:rPr>
+                <w:rFonts w:ascii="Calibri" w:cs="Calibri" w:eastAsia="Calibri" w:hAnsi="Calibri"/>
+                <w:color w:val="1F2A1F"/>
+                <w:sz w:val="18"/>
+                <w:szCs w:val="18"/>
+              </w:rPr>
+              <w:t xml:space="preserve">Caducidad — 3 menciones</w:t>
+            </w:r>
+          </w:p>
+        </w:tc>
+        <w:tc>
+          <w:tcPr>
+            <w:tcW w:type="dxa" w:w="7056"/>
+            <w:tcBorders>
+              <w:top w:val="single" w:color="D6DED2" w:sz="4"/>
+              <w:left w:val="single" w:color="D6DED2" w:sz="4"/>
+              <w:bottom w:val="single" w:color="D6DED2" w:sz="4"/>
+              <w:right w:val="single" w:color="D6DED2" w:sz="4"/>
+            </w:tcBorders>
+            <w:shd w:fill="FFFFFF" w:val="clear"/>
+            <w:tcMar>
+              <w:top w:type="dxa" w:w="130"/>
+              <w:left w:type="dxa" w:w="160"/>
+              <w:bottom w:type="dxa" w:w="130"/>
+              <w:right w:type="dxa" w:w="160"/>
+            </w:tcMar>
+            <w:vAlign w:val="top"/>
+          </w:tcPr>
+          <w:p>
+            <w:r>
+              <w:rPr>
+                <w:rFonts w:ascii="Calibri" w:cs="Calibri" w:eastAsia="Calibri" w:hAnsi="Calibri"/>
+                <w:color w:val="1F2A1F"/>
+                <w:sz w:val="18"/>
+                <w:szCs w:val="18"/>
+              </w:rPr>
+              <w:t xml:space="preserve">"Cuando la gente deja la comida en la nevera durante mucho tiempo y se estropea."</w:t>
+            </w:r>
+          </w:p>
+        </w:tc>
+      </w:tr>
+      <w:tr>
+        <w:tc>
+          <w:tcPr>
+            <w:tcW w:type="dxa" w:w="3024"/>
+            <w:tcBorders>
+              <w:top w:val="single" w:color="D6DED2" w:sz="4"/>
+              <w:left w:val="single" w:color="D6DED2" w:sz="4"/>
+              <w:bottom w:val="single" w:color="D6DED2" w:sz="4"/>
+              <w:right w:val="single" w:color="D6DED2" w:sz="4"/>
+            </w:tcBorders>
+            <w:shd w:fill="F2EFE7" w:val="clear"/>
+            <w:tcMar>
+              <w:top w:type="dxa" w:w="130"/>
+              <w:left w:type="dxa" w:w="160"/>
+              <w:bottom w:type="dxa" w:w="130"/>
+              <w:right w:type="dxa" w:w="160"/>
+            </w:tcMar>
+            <w:vAlign w:val="top"/>
+          </w:tcPr>
+          <w:p>
+            <w:r>
+              <w:rPr>
+                <w:rFonts w:ascii="Calibri" w:cs="Calibri" w:eastAsia="Calibri" w:hAnsi="Calibri"/>
+                <w:color w:val="1F2A1F"/>
+                <w:sz w:val="18"/>
+                <w:szCs w:val="18"/>
+              </w:rPr>
+              <w:t xml:space="preserve">Se acaba y nadie avisa — Galicia</w:t>
+            </w:r>
+          </w:p>
+        </w:tc>
+        <w:tc>
+          <w:tcPr>
+            <w:tcW w:type="dxa" w:w="7056"/>
+            <w:tcBorders>
+              <w:top w:val="single" w:color="D6DED2" w:sz="4"/>
+              <w:left w:val="single" w:color="D6DED2" w:sz="4"/>
+              <w:bottom w:val="single" w:color="D6DED2" w:sz="4"/>
+              <w:right w:val="single" w:color="D6DED2" w:sz="4"/>
+            </w:tcBorders>
+            <w:shd w:fill="F2EFE7" w:val="clear"/>
+            <w:tcMar>
+              <w:top w:type="dxa" w:w="130"/>
+              <w:left w:type="dxa" w:w="160"/>
+              <w:bottom w:type="dxa" w:w="130"/>
+              <w:right w:type="dxa" w:w="160"/>
+            </w:tcMar>
+            <w:vAlign w:val="top"/>
+          </w:tcPr>
+          <w:p>
+            <w:r>
+              <w:rPr>
+                <w:rFonts w:ascii="Calibri" w:cs="Calibri" w:eastAsia="Calibri" w:hAnsi="Calibri"/>
+                <w:color w:val="1F2A1F"/>
+                <w:sz w:val="18"/>
+                <w:szCs w:val="18"/>
+              </w:rPr>
+              <w:t xml:space="preserve">"Pois supoño que cando algo se acabe ninguén avise" — resuelto gratis en cuanto Fridge es una vista compartida.</w:t>
+            </w:r>
+          </w:p>
+        </w:tc>
+      </w:tr>
+    </w:tbl>
+    <w:p>
+      <w:r>
+        <w:br w:type="page"/>
+      </w:r>
+    </w:p>
+    <w:p>
+      <w:pPr>
+        <w:spacing w:after="60"/>
+      </w:pPr>
+      <w:r>
+        <w:rPr>
+          <w:rFonts w:ascii="Calibri" w:cs="Calibri" w:eastAsia="Calibri" w:hAnsi="Calibri"/>
+          <w:b/>
+          <w:bCs/>
+          <w:color w:val="C6821E"/>
+          <w:spacing w:val="26"/>
+          <w:sz w:val="17"/>
+          <w:szCs w:val="17"/>
+        </w:rPr>
+        <w:t xml:space="preserve">ALCANCE</w:t>
+      </w:r>
+    </w:p>
+    <w:p>
+      <w:pPr>
+        <w:spacing w:after="200"/>
+      </w:pPr>
+      <w:r>
+        <w:rPr>
+          <w:rFonts w:ascii="Georgia" w:cs="Georgia" w:eastAsia="Georgia" w:hAnsi="Georgia"/>
+          <w:b/>
+          <w:bCs/>
+          <w:color w:val="1F2A1F"/>
+          <w:sz w:val="38"/>
+          <w:szCs w:val="38"/>
+        </w:rPr>
+        <w:t xml:space="preserve">Qué construimos, y qué no</w:t>
+      </w:r>
+    </w:p>
+    <w:p>
+      <w:pPr>
+        <w:spacing w:after="160" w:line="310"/>
+      </w:pPr>
+      <w:r>
+        <w:rPr>
+          <w:rFonts w:ascii="Calibri" w:cs="Calibri" w:eastAsia="Calibri" w:hAnsi="Calibri"/>
+          <w:color w:val="1F2A1F"/>
+          <w:sz w:val="21"/>
+          <w:szCs w:val="21"/>
+        </w:rPr>
+        <w:t xml:space="preserve">El giro de producto retira lo que un servicio externo gratuito ya resuelve mejor, y deja fuera lo que nadie os elegiría por construir.</w:t>
+      </w:r>
+    </w:p>
+    <w:p>
+      <w:pPr>
+        <w:spacing w:after="80"/>
+      </w:pPr>
+    </w:p>
+    <w:tbl>
+      <w:tblPr>
+        <w:tblW w:type="dxa" w:w="10080"/>
+        <w:tblBorders>
+          <w:top w:val="none" w:color="FFFFFF" w:sz="0"/>
+          <w:left w:val="none" w:color="FFFFFF" w:sz="0"/>
+          <w:bottom w:val="none" w:color="FFFFFF" w:sz="0"/>
+          <w:right w:val="none" w:color="FFFFFF" w:sz="0"/>
+          <w:insideH w:val="none" w:color="FFFFFF" w:sz="0"/>
+          <w:insideV w:val="none" w:color="FFFFFF" w:sz="0"/>
+        </w:tblBorders>
+      </w:tblPr>
+      <w:tblGrid>
+        <w:gridCol w:w="3427"/>
+        <w:gridCol w:w="3326"/>
+        <w:gridCol w:w="3326"/>
+      </w:tblGrid>
+      <w:tr>
+        <w:trPr>
+          <w:tblHeader/>
+        </w:trPr>
+        <w:tc>
+          <w:tcPr>
+            <w:tcW w:type="dxa" w:w="3427"/>
+            <w:tcBorders>
+              <w:top w:val="single" w:color="26402C" w:sz="4"/>
+              <w:left w:val="single" w:color="26402C" w:sz="4"/>
+              <w:bottom w:val="single" w:color="26402C" w:sz="4"/>
+              <w:right w:val="single" w:color="26402C" w:sz="4"/>
+            </w:tcBorders>
+            <w:shd w:fill="26402C" w:val="clear"/>
+            <w:tcMar>
+              <w:top w:type="dxa" w:w="130"/>
+              <w:left w:type="dxa" w:w="160"/>
+              <w:bottom w:type="dxa" w:w="130"/>
+              <w:right w:type="dxa" w:w="160"/>
+            </w:tcMar>
+            <w:vAlign w:val="center"/>
+          </w:tcPr>
+          <w:p>
+            <w:r>
+              <w:rPr>
+                <w:rFonts w:ascii="Calibri" w:cs="Calibri" w:eastAsia="Calibri" w:hAnsi="Calibri"/>
+                <w:b/>
+                <w:bCs/>
+                <w:color w:val="FFFFFF"/>
+                <w:sz w:val="18"/>
+                <w:szCs w:val="18"/>
+              </w:rPr>
+              <w:t xml:space="preserve">Lo construimos</w:t>
+            </w:r>
+          </w:p>
+        </w:tc>
+        <w:tc>
+          <w:tcPr>
+            <w:tcW w:type="dxa" w:w="3326"/>
+            <w:tcBorders>
+              <w:top w:val="single" w:color="26402C" w:sz="4"/>
+              <w:left w:val="single" w:color="26402C" w:sz="4"/>
+              <w:bottom w:val="single" w:color="26402C" w:sz="4"/>
+              <w:right w:val="single" w:color="26402C" w:sz="4"/>
+            </w:tcBorders>
+            <w:shd w:fill="26402C" w:val="clear"/>
+            <w:tcMar>
+              <w:top w:type="dxa" w:w="130"/>
+              <w:left w:type="dxa" w:w="160"/>
+              <w:bottom w:type="dxa" w:w="130"/>
+              <w:right w:type="dxa" w:w="160"/>
+            </w:tcMar>
+            <w:vAlign w:val="center"/>
+          </w:tcPr>
+          <w:p>
+            <w:r>
+              <w:rPr>
+                <w:rFonts w:ascii="Calibri" w:cs="Calibri" w:eastAsia="Calibri" w:hAnsi="Calibri"/>
+                <w:b/>
+                <w:bCs/>
+                <w:color w:val="FFFFFF"/>
+                <w:sz w:val="18"/>
+                <w:szCs w:val="18"/>
+              </w:rPr>
+              <w:t xml:space="preserve">Lo hace un servicio externo</w:t>
+            </w:r>
+          </w:p>
+        </w:tc>
+        <w:tc>
+          <w:tcPr>
+            <w:tcW w:type="dxa" w:w="3326"/>
+            <w:tcBorders>
+              <w:top w:val="single" w:color="26402C" w:sz="4"/>
+              <w:left w:val="single" w:color="26402C" w:sz="4"/>
+              <w:bottom w:val="single" w:color="26402C" w:sz="4"/>
+              <w:right w:val="single" w:color="26402C" w:sz="4"/>
+            </w:tcBorders>
+            <w:shd w:fill="26402C" w:val="clear"/>
+            <w:tcMar>
+              <w:top w:type="dxa" w:w="130"/>
+              <w:left w:type="dxa" w:w="160"/>
+              <w:bottom w:type="dxa" w:w="130"/>
+              <w:right w:type="dxa" w:w="160"/>
+            </w:tcMar>
+            <w:vAlign w:val="center"/>
+          </w:tcPr>
+          <w:p>
+            <w:r>
+              <w:rPr>
+                <w:rFonts w:ascii="Calibri" w:cs="Calibri" w:eastAsia="Calibri" w:hAnsi="Calibri"/>
+                <w:b/>
+                <w:bCs/>
+                <w:color w:val="FFFFFF"/>
+                <w:sz w:val="18"/>
+                <w:szCs w:val="18"/>
+              </w:rPr>
+              <w:t xml:space="preserve">No se hace este curso</w:t>
+            </w:r>
+          </w:p>
+        </w:tc>
+      </w:tr>
+      <w:tr>
+        <w:tc>
+          <w:tcPr>
+            <w:tcW w:type="dxa" w:w="3427"/>
+            <w:tcBorders>
+              <w:top w:val="single" w:color="D6DED2" w:sz="4"/>
+              <w:left w:val="single" w:color="D6DED2" w:sz="4"/>
+              <w:bottom w:val="single" w:color="D6DED2" w:sz="4"/>
+              <w:right w:val="single" w:color="D6DED2" w:sz="4"/>
+            </w:tcBorders>
+            <w:shd w:fill="FFFFFF" w:val="clear"/>
+            <w:tcMar>
+              <w:top w:type="dxa" w:w="130"/>
+              <w:left w:type="dxa" w:w="160"/>
+              <w:bottom w:type="dxa" w:w="130"/>
+              <w:right w:type="dxa" w:w="160"/>
+            </w:tcMar>
+            <w:vAlign w:val="top"/>
+          </w:tcPr>
+          <w:p>
+            <w:r>
+              <w:rPr>
+                <w:rFonts w:ascii="Calibri" w:cs="Calibri" w:eastAsia="Calibri" w:hAnsi="Calibri"/>
+                <w:color w:val="1F2A1F"/>
+                <w:sz w:val="18"/>
+                <w:szCs w:val="18"/>
+              </w:rPr>
+              <w:t xml:space="preserve">Fridge de 3 estados · List que se genera sola, con concurrencia · History (quién debe qué) · Prices sobre el propio historial · Predicción de reposición</w:t>
+            </w:r>
+          </w:p>
+        </w:tc>
+        <w:tc>
+          <w:tcPr>
+            <w:tcW w:type="dxa" w:w="3326"/>
+            <w:tcBorders>
+              <w:top w:val="single" w:color="D6DED2" w:sz="4"/>
+              <w:left w:val="single" w:color="D6DED2" w:sz="4"/>
+              <w:bottom w:val="single" w:color="D6DED2" w:sz="4"/>
+              <w:right w:val="single" w:color="D6DED2" w:sz="4"/>
+            </w:tcBorders>
+            <w:shd w:fill="FFFFFF" w:val="clear"/>
+            <w:tcMar>
+              <w:top w:type="dxa" w:w="130"/>
+              <w:left w:type="dxa" w:w="160"/>
+              <w:bottom w:type="dxa" w:w="130"/>
+              <w:right w:type="dxa" w:w="160"/>
+            </w:tcMar>
+            <w:vAlign w:val="top"/>
+          </w:tcPr>
+          <w:p>
+            <w:r>
+              <w:rPr>
+                <w:rFonts w:ascii="Calibri" w:cs="Calibri" w:eastAsia="Calibri" w:hAnsi="Calibri"/>
+                <w:color w:val="1F2A1F"/>
+                <w:sz w:val="18"/>
+                <w:szCs w:val="18"/>
+              </w:rPr>
+              <w:t xml:space="preserve">Diccionario de productos (Open Food Facts) · Lectura de tickets (Groq, único uso de IA) · Aviso de turno de compra (bot de Telegram)</w:t>
+            </w:r>
+          </w:p>
+        </w:tc>
+        <w:tc>
+          <w:tcPr>
+            <w:tcW w:type="dxa" w:w="3326"/>
+            <w:tcBorders>
+              <w:top w:val="single" w:color="D6DED2" w:sz="4"/>
+              <w:left w:val="single" w:color="D6DED2" w:sz="4"/>
+              <w:bottom w:val="single" w:color="D6DED2" w:sz="4"/>
+              <w:right w:val="single" w:color="D6DED2" w:sz="4"/>
+            </w:tcBorders>
+            <w:shd w:fill="FFFFFF" w:val="clear"/>
+            <w:tcMar>
+              <w:top w:type="dxa" w:w="130"/>
+              <w:left w:type="dxa" w:w="160"/>
+              <w:bottom w:type="dxa" w:w="130"/>
+              <w:right w:type="dxa" w:w="160"/>
+            </w:tcMar>
+            <w:vAlign w:val="top"/>
+          </w:tcPr>
+          <w:p>
+            <w:r>
+              <w:rPr>
+                <w:rFonts w:ascii="Calibri" w:cs="Calibri" w:eastAsia="Calibri" w:hAnsi="Calibri"/>
+                <w:color w:val="1F2A1F"/>
+                <w:sz w:val="18"/>
+                <w:szCs w:val="18"/>
+              </w:rPr>
+              <w:t xml:space="preserve">Escaneo de código de barras · Cobro real con tarjeta · Liquidar deudas de verdad · Notificaciones push nativas (Telegram es la excepción)</w:t>
+            </w:r>
+          </w:p>
+        </w:tc>
+      </w:tr>
+    </w:tbl>
+    <w:p>
+      <w:r>
+        <w:br w:type="page"/>
+      </w:r>
+    </w:p>
+    <w:p>
+      <w:pPr>
+        <w:spacing w:after="60"/>
+      </w:pPr>
+      <w:r>
+        <w:rPr>
+          <w:rFonts w:ascii="Calibri" w:cs="Calibri" w:eastAsia="Calibri" w:hAnsi="Calibri"/>
+          <w:b/>
+          <w:bCs/>
+          <w:color w:val="C6821E"/>
+          <w:spacing w:val="26"/>
+          <w:sz w:val="17"/>
+          <w:szCs w:val="17"/>
+        </w:rPr>
+        <w:t xml:space="preserve">MERCADO Y VALIDACIÓN</w:t>
+      </w:r>
+    </w:p>
+    <w:p>
+      <w:pPr>
+        <w:spacing w:after="200"/>
+      </w:pPr>
+      <w:r>
+        <w:rPr>
+          <w:rFonts w:ascii="Georgia" w:cs="Georgia" w:eastAsia="Georgia" w:hAnsi="Georgia"/>
+          <w:b/>
+          <w:bCs/>
+          <w:color w:val="1F2A1F"/>
           <w:sz w:val="38"/>
           <w:szCs w:val="38"/>
         </w:rPr>
@@ -1411,12 +2072,12 @@
           <w:tcPr>
             <w:tcW w:type="dxa" w:w="2620"/>
             <w:tcBorders>
-              <w:top w:val="single" w:color="2A211B" w:sz="4"/>
-              <w:left w:val="single" w:color="2A211B" w:sz="4"/>
-              <w:bottom w:val="single" w:color="2A211B" w:sz="4"/>
-              <w:right w:val="single" w:color="2A211B" w:sz="4"/>
-            </w:tcBorders>
-            <w:shd w:fill="2A211B" w:val="clear"/>
+              <w:top w:val="single" w:color="26402C" w:sz="4"/>
+              <w:left w:val="single" w:color="26402C" w:sz="4"/>
+              <w:bottom w:val="single" w:color="26402C" w:sz="4"/>
+              <w:right w:val="single" w:color="26402C" w:sz="4"/>
+            </w:tcBorders>
+            <w:shd w:fill="26402C" w:val="clear"/>
             <w:tcMar>
               <w:top w:type="dxa" w:w="130"/>
               <w:left w:type="dxa" w:w="160"/>
@@ -1443,12 +2104,12 @@
           <w:tcPr>
             <w:tcW w:type="dxa" w:w="1814"/>
             <w:tcBorders>
-              <w:top w:val="single" w:color="2A211B" w:sz="4"/>
-              <w:left w:val="single" w:color="2A211B" w:sz="4"/>
-              <w:bottom w:val="single" w:color="2A211B" w:sz="4"/>
-              <w:right w:val="single" w:color="2A211B" w:sz="4"/>
-            </w:tcBorders>
-            <w:shd w:fill="2A211B" w:val="clear"/>
+              <w:top w:val="single" w:color="26402C" w:sz="4"/>
+              <w:left w:val="single" w:color="26402C" w:sz="4"/>
+              <w:bottom w:val="single" w:color="26402C" w:sz="4"/>
+              <w:right w:val="single" w:color="26402C" w:sz="4"/>
+            </w:tcBorders>
+            <w:shd w:fill="26402C" w:val="clear"/>
             <w:tcMar>
               <w:top w:type="dxa" w:w="130"/>
               <w:left w:type="dxa" w:w="160"/>
@@ -1475,12 +2136,12 @@
           <w:tcPr>
             <w:tcW w:type="dxa" w:w="5644"/>
             <w:tcBorders>
-              <w:top w:val="single" w:color="2A211B" w:sz="4"/>
-              <w:left w:val="single" w:color="2A211B" w:sz="4"/>
-              <w:bottom w:val="single" w:color="2A211B" w:sz="4"/>
-              <w:right w:val="single" w:color="2A211B" w:sz="4"/>
-            </w:tcBorders>
-            <w:shd w:fill="2A211B" w:val="clear"/>
+              <w:top w:val="single" w:color="26402C" w:sz="4"/>
+              <w:left w:val="single" w:color="26402C" w:sz="4"/>
+              <w:bottom w:val="single" w:color="26402C" w:sz="4"/>
+              <w:right w:val="single" w:color="26402C" w:sz="4"/>
+            </w:tcBorders>
+            <w:shd w:fill="26402C" w:val="clear"/>
             <w:tcMar>
               <w:top w:type="dxa" w:w="130"/>
               <w:left w:type="dxa" w:w="160"/>
@@ -1509,10 +2170,10 @@
           <w:tcPr>
             <w:tcW w:type="dxa" w:w="2620"/>
             <w:tcBorders>
-              <w:top w:val="single" w:color="DDD3C7" w:sz="4"/>
-              <w:left w:val="single" w:color="DDD3C7" w:sz="4"/>
-              <w:bottom w:val="single" w:color="DDD3C7" w:sz="4"/>
-              <w:right w:val="single" w:color="DDD3C7" w:sz="4"/>
+              <w:top w:val="single" w:color="D6DED2" w:sz="4"/>
+              <w:left w:val="single" w:color="D6DED2" w:sz="4"/>
+              <w:bottom w:val="single" w:color="D6DED2" w:sz="4"/>
+              <w:right w:val="single" w:color="D6DED2" w:sz="4"/>
             </w:tcBorders>
             <w:shd w:fill="FFFFFF" w:val="clear"/>
             <w:tcMar>
@@ -1527,7 +2188,7 @@
             <w:r>
               <w:rPr>
                 <w:rFonts w:ascii="Calibri" w:cs="Calibri" w:eastAsia="Calibri" w:hAnsi="Calibri"/>
-                <w:color w:val="1E1B18"/>
+                <w:color w:val="1F2A1F"/>
                 <w:sz w:val="18"/>
                 <w:szCs w:val="18"/>
               </w:rPr>
@@ -1539,10 +2200,10 @@
           <w:tcPr>
             <w:tcW w:type="dxa" w:w="1814"/>
             <w:tcBorders>
-              <w:top w:val="single" w:color="DDD3C7" w:sz="4"/>
-              <w:left w:val="single" w:color="DDD3C7" w:sz="4"/>
-              <w:bottom w:val="single" w:color="DDD3C7" w:sz="4"/>
-              <w:right w:val="single" w:color="DDD3C7" w:sz="4"/>
+              <w:top w:val="single" w:color="D6DED2" w:sz="4"/>
+              <w:left w:val="single" w:color="D6DED2" w:sz="4"/>
+              <w:bottom w:val="single" w:color="D6DED2" w:sz="4"/>
+              <w:right w:val="single" w:color="D6DED2" w:sz="4"/>
             </w:tcBorders>
             <w:shd w:fill="FFFFFF" w:val="clear"/>
             <w:tcMar>
@@ -1557,7 +2218,7 @@
             <w:r>
               <w:rPr>
                 <w:rFonts w:ascii="Calibri" w:cs="Calibri" w:eastAsia="Calibri" w:hAnsi="Calibri"/>
-                <w:color w:val="1E1B18"/>
+                <w:color w:val="1F2A1F"/>
                 <w:sz w:val="18"/>
                 <w:szCs w:val="18"/>
               </w:rPr>
@@ -1569,10 +2230,10 @@
           <w:tcPr>
             <w:tcW w:type="dxa" w:w="5644"/>
             <w:tcBorders>
-              <w:top w:val="single" w:color="DDD3C7" w:sz="4"/>
-              <w:left w:val="single" w:color="DDD3C7" w:sz="4"/>
-              <w:bottom w:val="single" w:color="DDD3C7" w:sz="4"/>
-              <w:right w:val="single" w:color="DDD3C7" w:sz="4"/>
+              <w:top w:val="single" w:color="D6DED2" w:sz="4"/>
+              <w:left w:val="single" w:color="D6DED2" w:sz="4"/>
+              <w:bottom w:val="single" w:color="D6DED2" w:sz="4"/>
+              <w:right w:val="single" w:color="D6DED2" w:sz="4"/>
             </w:tcBorders>
             <w:shd w:fill="FFFFFF" w:val="clear"/>
             <w:tcMar>
@@ -1587,7 +2248,7 @@
             <w:r>
               <w:rPr>
                 <w:rFonts w:ascii="Calibri" w:cs="Calibri" w:eastAsia="Calibri" w:hAnsi="Calibri"/>
-                <w:color w:val="1E1B18"/>
+                <w:color w:val="1F2A1F"/>
                 <w:sz w:val="18"/>
                 <w:szCs w:val="18"/>
               </w:rPr>
@@ -1601,12 +2262,12 @@
           <w:tcPr>
             <w:tcW w:type="dxa" w:w="2620"/>
             <w:tcBorders>
-              <w:top w:val="single" w:color="DDD3C7" w:sz="4"/>
-              <w:left w:val="single" w:color="DDD3C7" w:sz="4"/>
-              <w:bottom w:val="single" w:color="DDD3C7" w:sz="4"/>
-              <w:right w:val="single" w:color="DDD3C7" w:sz="4"/>
-            </w:tcBorders>
-            <w:shd w:fill="F4E9DA" w:val="clear"/>
+              <w:top w:val="single" w:color="D6DED2" w:sz="4"/>
+              <w:left w:val="single" w:color="D6DED2" w:sz="4"/>
+              <w:bottom w:val="single" w:color="D6DED2" w:sz="4"/>
+              <w:right w:val="single" w:color="D6DED2" w:sz="4"/>
+            </w:tcBorders>
+            <w:shd w:fill="F2EFE7" w:val="clear"/>
             <w:tcMar>
               <w:top w:type="dxa" w:w="130"/>
               <w:left w:type="dxa" w:w="160"/>
@@ -1619,7 +2280,7 @@
             <w:r>
               <w:rPr>
                 <w:rFonts w:ascii="Calibri" w:cs="Calibri" w:eastAsia="Calibri" w:hAnsi="Calibri"/>
-                <w:color w:val="1E1B18"/>
+                <w:color w:val="1F2A1F"/>
                 <w:sz w:val="18"/>
                 <w:szCs w:val="18"/>
               </w:rPr>
@@ -1631,12 +2292,12 @@
           <w:tcPr>
             <w:tcW w:type="dxa" w:w="1814"/>
             <w:tcBorders>
-              <w:top w:val="single" w:color="DDD3C7" w:sz="4"/>
-              <w:left w:val="single" w:color="DDD3C7" w:sz="4"/>
-              <w:bottom w:val="single" w:color="DDD3C7" w:sz="4"/>
-              <w:right w:val="single" w:color="DDD3C7" w:sz="4"/>
-            </w:tcBorders>
-            <w:shd w:fill="F4E9DA" w:val="clear"/>
+              <w:top w:val="single" w:color="D6DED2" w:sz="4"/>
+              <w:left w:val="single" w:color="D6DED2" w:sz="4"/>
+              <w:bottom w:val="single" w:color="D6DED2" w:sz="4"/>
+              <w:right w:val="single" w:color="D6DED2" w:sz="4"/>
+            </w:tcBorders>
+            <w:shd w:fill="F2EFE7" w:val="clear"/>
             <w:tcMar>
               <w:top w:type="dxa" w:w="130"/>
               <w:left w:type="dxa" w:w="160"/>
@@ -1649,7 +2310,7 @@
             <w:r>
               <w:rPr>
                 <w:rFonts w:ascii="Calibri" w:cs="Calibri" w:eastAsia="Calibri" w:hAnsi="Calibri"/>
-                <w:color w:val="1E1B18"/>
+                <w:color w:val="1F2A1F"/>
                 <w:sz w:val="18"/>
                 <w:szCs w:val="18"/>
               </w:rPr>
@@ -1661,12 +2322,12 @@
           <w:tcPr>
             <w:tcW w:type="dxa" w:w="5644"/>
             <w:tcBorders>
-              <w:top w:val="single" w:color="DDD3C7" w:sz="4"/>
-              <w:left w:val="single" w:color="DDD3C7" w:sz="4"/>
-              <w:bottom w:val="single" w:color="DDD3C7" w:sz="4"/>
-              <w:right w:val="single" w:color="DDD3C7" w:sz="4"/>
-            </w:tcBorders>
-            <w:shd w:fill="F4E9DA" w:val="clear"/>
+              <w:top w:val="single" w:color="D6DED2" w:sz="4"/>
+              <w:left w:val="single" w:color="D6DED2" w:sz="4"/>
+              <w:bottom w:val="single" w:color="D6DED2" w:sz="4"/>
+              <w:right w:val="single" w:color="D6DED2" w:sz="4"/>
+            </w:tcBorders>
+            <w:shd w:fill="F2EFE7" w:val="clear"/>
             <w:tcMar>
               <w:top w:type="dxa" w:w="130"/>
               <w:left w:type="dxa" w:w="160"/>
@@ -1679,7 +2340,7 @@
             <w:r>
               <w:rPr>
                 <w:rFonts w:ascii="Calibri" w:cs="Calibri" w:eastAsia="Calibri" w:hAnsi="Calibri"/>
-                <w:color w:val="1E1B18"/>
+                <w:color w:val="1F2A1F"/>
                 <w:sz w:val="18"/>
                 <w:szCs w:val="18"/>
               </w:rPr>
@@ -1693,10 +2354,10 @@
           <w:tcPr>
             <w:tcW w:type="dxa" w:w="2620"/>
             <w:tcBorders>
-              <w:top w:val="single" w:color="DDD3C7" w:sz="4"/>
-              <w:left w:val="single" w:color="DDD3C7" w:sz="4"/>
-              <w:bottom w:val="single" w:color="DDD3C7" w:sz="4"/>
-              <w:right w:val="single" w:color="DDD3C7" w:sz="4"/>
+              <w:top w:val="single" w:color="D6DED2" w:sz="4"/>
+              <w:left w:val="single" w:color="D6DED2" w:sz="4"/>
+              <w:bottom w:val="single" w:color="D6DED2" w:sz="4"/>
+              <w:right w:val="single" w:color="D6DED2" w:sz="4"/>
             </w:tcBorders>
             <w:shd w:fill="FFFFFF" w:val="clear"/>
             <w:tcMar>
@@ -1711,7 +2372,7 @@
             <w:r>
               <w:rPr>
                 <w:rFonts w:ascii="Calibri" w:cs="Calibri" w:eastAsia="Calibri" w:hAnsi="Calibri"/>
-                <w:color w:val="1E1B18"/>
+                <w:color w:val="1F2A1F"/>
                 <w:sz w:val="18"/>
                 <w:szCs w:val="18"/>
               </w:rPr>
@@ -1723,10 +2384,10 @@
           <w:tcPr>
             <w:tcW w:type="dxa" w:w="1814"/>
             <w:tcBorders>
-              <w:top w:val="single" w:color="DDD3C7" w:sz="4"/>
-              <w:left w:val="single" w:color="DDD3C7" w:sz="4"/>
-              <w:bottom w:val="single" w:color="DDD3C7" w:sz="4"/>
-              <w:right w:val="single" w:color="DDD3C7" w:sz="4"/>
+              <w:top w:val="single" w:color="D6DED2" w:sz="4"/>
+              <w:left w:val="single" w:color="D6DED2" w:sz="4"/>
+              <w:bottom w:val="single" w:color="D6DED2" w:sz="4"/>
+              <w:right w:val="single" w:color="D6DED2" w:sz="4"/>
             </w:tcBorders>
             <w:shd w:fill="FFFFFF" w:val="clear"/>
             <w:tcMar>
@@ -1741,7 +2402,7 @@
             <w:r>
               <w:rPr>
                 <w:rFonts w:ascii="Calibri" w:cs="Calibri" w:eastAsia="Calibri" w:hAnsi="Calibri"/>
-                <w:color w:val="1E1B18"/>
+                <w:color w:val="1F2A1F"/>
                 <w:sz w:val="18"/>
                 <w:szCs w:val="18"/>
               </w:rPr>
@@ -1753,10 +2414,10 @@
           <w:tcPr>
             <w:tcW w:type="dxa" w:w="5644"/>
             <w:tcBorders>
-              <w:top w:val="single" w:color="DDD3C7" w:sz="4"/>
-              <w:left w:val="single" w:color="DDD3C7" w:sz="4"/>
-              <w:bottom w:val="single" w:color="DDD3C7" w:sz="4"/>
-              <w:right w:val="single" w:color="DDD3C7" w:sz="4"/>
+              <w:top w:val="single" w:color="D6DED2" w:sz="4"/>
+              <w:left w:val="single" w:color="D6DED2" w:sz="4"/>
+              <w:bottom w:val="single" w:color="D6DED2" w:sz="4"/>
+              <w:right w:val="single" w:color="D6DED2" w:sz="4"/>
             </w:tcBorders>
             <w:shd w:fill="FFFFFF" w:val="clear"/>
             <w:tcMar>
@@ -1771,7 +2432,7 @@
             <w:r>
               <w:rPr>
                 <w:rFonts w:ascii="Calibri" w:cs="Calibri" w:eastAsia="Calibri" w:hAnsi="Calibri"/>
-                <w:color w:val="1E1B18"/>
+                <w:color w:val="1F2A1F"/>
                 <w:sz w:val="18"/>
                 <w:szCs w:val="18"/>
               </w:rPr>
@@ -1807,12 +2468,12 @@
           <w:tcPr>
             <w:tcW w:type="dxa" w:w="5040"/>
             <w:tcBorders>
-              <w:top w:val="single" w:color="2A211B" w:sz="4"/>
-              <w:left w:val="single" w:color="2A211B" w:sz="4"/>
-              <w:bottom w:val="single" w:color="2A211B" w:sz="4"/>
-              <w:right w:val="single" w:color="2A211B" w:sz="4"/>
-            </w:tcBorders>
-            <w:shd w:fill="2A211B" w:val="clear"/>
+              <w:top w:val="single" w:color="26402C" w:sz="4"/>
+              <w:left w:val="single" w:color="26402C" w:sz="4"/>
+              <w:bottom w:val="single" w:color="26402C" w:sz="4"/>
+              <w:right w:val="single" w:color="26402C" w:sz="4"/>
+            </w:tcBorders>
+            <w:shd w:fill="26402C" w:val="clear"/>
             <w:tcMar>
               <w:top w:type="dxa" w:w="220"/>
               <w:left w:type="dxa" w:w="220"/>
@@ -1830,7 +2491,7 @@
                 <w:rFonts w:ascii="Georgia" w:cs="Georgia" w:eastAsia="Georgia" w:hAnsi="Georgia"/>
                 <w:b/>
                 <w:bCs/>
-                <w:color w:val="C99A3E"/>
+                <w:color w:val="E3A94A"/>
                 <w:sz w:val="34"/>
                 <w:szCs w:val="34"/>
               </w:rPr>
@@ -1853,12 +2514,12 @@
           <w:tcPr>
             <w:tcW w:type="dxa" w:w="5040"/>
             <w:tcBorders>
-              <w:top w:val="single" w:color="DDD3C7" w:sz="4"/>
-              <w:left w:val="single" w:color="DDD3C7" w:sz="4"/>
-              <w:bottom w:val="single" w:color="DDD3C7" w:sz="4"/>
-              <w:right w:val="single" w:color="DDD3C7" w:sz="4"/>
-            </w:tcBorders>
-            <w:shd w:fill="F4E9DA" w:val="clear"/>
+              <w:top w:val="single" w:color="D6DED2" w:sz="4"/>
+              <w:left w:val="single" w:color="D6DED2" w:sz="4"/>
+              <w:bottom w:val="single" w:color="D6DED2" w:sz="4"/>
+              <w:right w:val="single" w:color="D6DED2" w:sz="4"/>
+            </w:tcBorders>
+            <w:shd w:fill="F2EFE7" w:val="clear"/>
             <w:tcMar>
               <w:top w:type="dxa" w:w="220"/>
               <w:left w:type="dxa" w:w="220"/>
@@ -1876,7 +2537,7 @@
                 <w:rFonts w:ascii="Georgia" w:cs="Georgia" w:eastAsia="Georgia" w:hAnsi="Georgia"/>
                 <w:b/>
                 <w:bCs/>
-                <w:color w:val="B5651D"/>
+                <w:color w:val="C6821E"/>
                 <w:sz w:val="34"/>
                 <w:szCs w:val="34"/>
               </w:rPr>
@@ -1887,7 +2548,7 @@
             <w:r>
               <w:rPr>
                 <w:rFonts w:ascii="Calibri" w:cs="Calibri" w:eastAsia="Calibri" w:hAnsi="Calibri"/>
-                <w:color w:val="857A6E"/>
+                <w:color w:val="5B6559"/>
                 <w:sz w:val="17"/>
                 <w:szCs w:val="17"/>
               </w:rPr>
@@ -1909,7 +2570,7 @@
       <w:r>
         <w:rPr>
           <w:rFonts w:ascii="Calibri" w:cs="Calibri" w:eastAsia="Calibri" w:hAnsi="Calibri"/>
-          <w:color w:val="1E1B18"/>
+          <w:color w:val="1F2A1F"/>
           <w:sz w:val="21"/>
           <w:szCs w:val="21"/>
         </w:rPr>
@@ -1930,7 +2591,7 @@
           <w:rFonts w:ascii="Calibri" w:cs="Calibri" w:eastAsia="Calibri" w:hAnsi="Calibri"/>
           <w:b/>
           <w:bCs/>
-          <w:color w:val="B5651D"/>
+          <w:color w:val="C6821E"/>
           <w:spacing w:val="26"/>
           <w:sz w:val="17"/>
           <w:szCs w:val="17"/>
@@ -1947,7 +2608,7 @@
           <w:rFonts w:ascii="Georgia" w:cs="Georgia" w:eastAsia="Georgia" w:hAnsi="Georgia"/>
           <w:b/>
           <w:bCs/>
-          <w:color w:val="1E1B18"/>
+          <w:color w:val="1F2A1F"/>
           <w:sz w:val="38"/>
           <w:szCs w:val="38"/>
         </w:rPr>
@@ -1975,12 +2636,12 @@
           <w:tcPr>
             <w:tcW w:type="dxa" w:w="4960"/>
             <w:tcBorders>
-              <w:top w:val="single" w:color="DDD3C7" w:sz="4"/>
-              <w:left w:val="single" w:color="DDD3C7" w:sz="4"/>
-              <w:bottom w:val="single" w:color="DDD3C7" w:sz="4"/>
-              <w:right w:val="single" w:color="DDD3C7" w:sz="4"/>
-            </w:tcBorders>
-            <w:shd w:fill="F4E9DA" w:val="clear"/>
+              <w:top w:val="single" w:color="D6DED2" w:sz="4"/>
+              <w:left w:val="single" w:color="D6DED2" w:sz="4"/>
+              <w:bottom w:val="single" w:color="D6DED2" w:sz="4"/>
+              <w:right w:val="single" w:color="D6DED2" w:sz="4"/>
+            </w:tcBorders>
+            <w:shd w:fill="F2EFE7" w:val="clear"/>
             <w:tcMar>
               <w:top w:type="dxa" w:w="240"/>
               <w:left w:type="dxa" w:w="240"/>
@@ -1998,7 +2659,7 @@
                 <w:rFonts w:ascii="Georgia" w:cs="Georgia" w:eastAsia="Georgia" w:hAnsi="Georgia"/>
                 <w:b/>
                 <w:bCs/>
-                <w:color w:val="B5651D"/>
+                <w:color w:val="C6821E"/>
                 <w:sz w:val="30"/>
                 <w:szCs w:val="30"/>
               </w:rPr>
@@ -2014,7 +2675,7 @@
                 <w:rFonts w:ascii="Calibri" w:cs="Calibri" w:eastAsia="Calibri" w:hAnsi="Calibri"/>
                 <w:b/>
                 <w:bCs/>
-                <w:color w:val="1E1B18"/>
+                <w:color w:val="1F2A1F"/>
                 <w:sz w:val="21"/>
                 <w:szCs w:val="21"/>
               </w:rPr>
@@ -2025,7 +2686,7 @@
             <w:r>
               <w:rPr>
                 <w:rFonts w:ascii="Calibri" w:cs="Calibri" w:eastAsia="Calibri" w:hAnsi="Calibri"/>
-                <w:color w:val="857A6E"/>
+                <w:color w:val="5B6559"/>
                 <w:sz w:val="19"/>
                 <w:szCs w:val="19"/>
               </w:rPr>
@@ -2037,12 +2698,12 @@
           <w:tcPr>
             <w:tcW w:type="dxa" w:w="4960"/>
             <w:tcBorders>
-              <w:top w:val="single" w:color="DDD3C7" w:sz="4"/>
-              <w:left w:val="single" w:color="DDD3C7" w:sz="4"/>
-              <w:bottom w:val="single" w:color="DDD3C7" w:sz="4"/>
-              <w:right w:val="single" w:color="DDD3C7" w:sz="4"/>
-            </w:tcBorders>
-            <w:shd w:fill="ECE1D2" w:val="clear"/>
+              <w:top w:val="single" w:color="D6DED2" w:sz="4"/>
+              <w:left w:val="single" w:color="D6DED2" w:sz="4"/>
+              <w:bottom w:val="single" w:color="D6DED2" w:sz="4"/>
+              <w:right w:val="single" w:color="D6DED2" w:sz="4"/>
+            </w:tcBorders>
+            <w:shd w:fill="E9E4D6" w:val="clear"/>
             <w:tcMar>
               <w:top w:type="dxa" w:w="240"/>
               <w:left w:type="dxa" w:w="240"/>
@@ -2060,7 +2721,7 @@
                 <w:rFonts w:ascii="Georgia" w:cs="Georgia" w:eastAsia="Georgia" w:hAnsi="Georgia"/>
                 <w:b/>
                 <w:bCs/>
-                <w:color w:val="B5651D"/>
+                <w:color w:val="C6821E"/>
                 <w:sz w:val="30"/>
                 <w:szCs w:val="30"/>
               </w:rPr>
@@ -2076,7 +2737,7 @@
                 <w:rFonts w:ascii="Calibri" w:cs="Calibri" w:eastAsia="Calibri" w:hAnsi="Calibri"/>
                 <w:b/>
                 <w:bCs/>
-                <w:color w:val="1E1B18"/>
+                <w:color w:val="1F2A1F"/>
                 <w:sz w:val="21"/>
                 <w:szCs w:val="21"/>
               </w:rPr>
@@ -2087,7 +2748,7 @@
             <w:r>
               <w:rPr>
                 <w:rFonts w:ascii="Calibri" w:cs="Calibri" w:eastAsia="Calibri" w:hAnsi="Calibri"/>
-                <w:color w:val="857A6E"/>
+                <w:color w:val="5B6559"/>
                 <w:sz w:val="19"/>
                 <w:szCs w:val="19"/>
               </w:rPr>
@@ -2101,12 +2762,12 @@
           <w:tcPr>
             <w:tcW w:type="dxa" w:w="4960"/>
             <w:tcBorders>
-              <w:top w:val="single" w:color="DDD3C7" w:sz="4"/>
-              <w:left w:val="single" w:color="DDD3C7" w:sz="4"/>
-              <w:bottom w:val="single" w:color="DDD3C7" w:sz="4"/>
-              <w:right w:val="single" w:color="DDD3C7" w:sz="4"/>
-            </w:tcBorders>
-            <w:shd w:fill="ECE1D2" w:val="clear"/>
+              <w:top w:val="single" w:color="D6DED2" w:sz="4"/>
+              <w:left w:val="single" w:color="D6DED2" w:sz="4"/>
+              <w:bottom w:val="single" w:color="D6DED2" w:sz="4"/>
+              <w:right w:val="single" w:color="D6DED2" w:sz="4"/>
+            </w:tcBorders>
+            <w:shd w:fill="E9E4D6" w:val="clear"/>
             <w:tcMar>
               <w:top w:type="dxa" w:w="240"/>
               <w:left w:type="dxa" w:w="240"/>
@@ -2124,7 +2785,7 @@
                 <w:rFonts w:ascii="Georgia" w:cs="Georgia" w:eastAsia="Georgia" w:hAnsi="Georgia"/>
                 <w:b/>
                 <w:bCs/>
-                <w:color w:val="B5651D"/>
+                <w:color w:val="C6821E"/>
                 <w:sz w:val="30"/>
                 <w:szCs w:val="30"/>
               </w:rPr>
@@ -2140,18 +2801,18 @@
                 <w:rFonts w:ascii="Calibri" w:cs="Calibri" w:eastAsia="Calibri" w:hAnsi="Calibri"/>
                 <w:b/>
                 <w:bCs/>
-                <w:color w:val="1E1B18"/>
+                <w:color w:val="1F2A1F"/>
                 <w:sz w:val="21"/>
                 <w:szCs w:val="21"/>
               </w:rPr>
-              <w:t xml:space="preserve">Lista compartida</w:t>
-            </w:r>
-          </w:p>
-          <w:p>
-            <w:r>
-              <w:rPr>
-                <w:rFonts w:ascii="Calibri" w:cs="Calibri" w:eastAsia="Calibri" w:hAnsi="Calibri"/>
-                <w:color w:val="857A6E"/>
+              <w:t xml:space="preserve">List</w:t>
+            </w:r>
+          </w:p>
+          <w:p>
+            <w:r>
+              <w:rPr>
+                <w:rFonts w:ascii="Calibri" w:cs="Calibri" w:eastAsia="Calibri" w:hAnsi="Calibri"/>
+                <w:color w:val="5B6559"/>
                 <w:sz w:val="19"/>
                 <w:szCs w:val="19"/>
               </w:rPr>
@@ -2163,12 +2824,12 @@
           <w:tcPr>
             <w:tcW w:type="dxa" w:w="4960"/>
             <w:tcBorders>
-              <w:top w:val="single" w:color="DDD3C7" w:sz="4"/>
-              <w:left w:val="single" w:color="DDD3C7" w:sz="4"/>
-              <w:bottom w:val="single" w:color="DDD3C7" w:sz="4"/>
-              <w:right w:val="single" w:color="DDD3C7" w:sz="4"/>
-            </w:tcBorders>
-            <w:shd w:fill="F4E9DA" w:val="clear"/>
+              <w:top w:val="single" w:color="D6DED2" w:sz="4"/>
+              <w:left w:val="single" w:color="D6DED2" w:sz="4"/>
+              <w:bottom w:val="single" w:color="D6DED2" w:sz="4"/>
+              <w:right w:val="single" w:color="D6DED2" w:sz="4"/>
+            </w:tcBorders>
+            <w:shd w:fill="F2EFE7" w:val="clear"/>
             <w:tcMar>
               <w:top w:type="dxa" w:w="240"/>
               <w:left w:type="dxa" w:w="240"/>
@@ -2186,7 +2847,7 @@
                 <w:rFonts w:ascii="Georgia" w:cs="Georgia" w:eastAsia="Georgia" w:hAnsi="Georgia"/>
                 <w:b/>
                 <w:bCs/>
-                <w:color w:val="B5651D"/>
+                <w:color w:val="C6821E"/>
                 <w:sz w:val="30"/>
                 <w:szCs w:val="30"/>
               </w:rPr>
@@ -2202,18 +2863,18 @@
                 <w:rFonts w:ascii="Calibri" w:cs="Calibri" w:eastAsia="Calibri" w:hAnsi="Calibri"/>
                 <w:b/>
                 <w:bCs/>
-                <w:color w:val="1E1B18"/>
+                <w:color w:val="1F2A1F"/>
                 <w:sz w:val="21"/>
                 <w:szCs w:val="21"/>
               </w:rPr>
-              <w:t xml:space="preserve">Historial y precios</w:t>
-            </w:r>
-          </w:p>
-          <w:p>
-            <w:r>
-              <w:rPr>
-                <w:rFonts w:ascii="Calibri" w:cs="Calibri" w:eastAsia="Calibri" w:hAnsi="Calibri"/>
-                <w:color w:val="857A6E"/>
+              <w:t xml:space="preserve">History / Prices</w:t>
+            </w:r>
+          </w:p>
+          <w:p>
+            <w:r>
+              <w:rPr>
+                <w:rFonts w:ascii="Calibri" w:cs="Calibri" w:eastAsia="Calibri" w:hAnsi="Calibri"/>
+                <w:color w:val="5B6559"/>
                 <w:sz w:val="19"/>
                 <w:szCs w:val="19"/>
               </w:rPr>
@@ -2231,7 +2892,7 @@
     <w:p>
       <w:pPr>
         <w:pBdr>
-          <w:bottom w:val="single" w:color="DDD3C7" w:sz="4" w:space="1"/>
+          <w:bottom w:val="single" w:color="D6DED2" w:sz="4" w:space="1"/>
         </w:pBdr>
         <w:spacing w:after="220" w:before="100"/>
       </w:pPr>
@@ -2245,7 +2906,7 @@
           <w:rFonts w:ascii="Calibri" w:cs="Calibri" w:eastAsia="Calibri" w:hAnsi="Calibri"/>
           <w:b/>
           <w:bCs/>
-          <w:color w:val="1E1B18"/>
+          <w:color w:val="1F2A1F"/>
           <w:sz w:val="21"/>
           <w:szCs w:val="21"/>
         </w:rPr>
@@ -2254,7 +2915,7 @@
       <w:r>
         <w:rPr>
           <w:rFonts w:ascii="Calibri" w:cs="Calibri" w:eastAsia="Calibri" w:hAnsi="Calibri"/>
-          <w:color w:val="857A6E"/>
+          <w:color w:val="5B6559"/>
           <w:sz w:val="21"/>
           <w:szCs w:val="21"/>
         </w:rPr>
@@ -2275,7 +2936,7 @@
           <w:rFonts w:ascii="Calibri" w:cs="Calibri" w:eastAsia="Calibri" w:hAnsi="Calibri"/>
           <w:b/>
           <w:bCs/>
-          <w:color w:val="B5651D"/>
+          <w:color w:val="C6821E"/>
           <w:spacing w:val="26"/>
           <w:sz w:val="17"/>
           <w:szCs w:val="17"/>
@@ -2292,7 +2953,7 @@
           <w:rFonts w:ascii="Georgia" w:cs="Georgia" w:eastAsia="Georgia" w:hAnsi="Georgia"/>
           <w:b/>
           <w:bCs/>
-          <w:color w:val="1E1B18"/>
+          <w:color w:val="1F2A1F"/>
           <w:sz w:val="38"/>
           <w:szCs w:val="38"/>
         </w:rPr>
@@ -2308,7 +2969,7 @@
           <w:rFonts w:ascii="Calibri" w:cs="Calibri" w:eastAsia="Calibri" w:hAnsi="Calibri"/>
           <w:b/>
           <w:bCs/>
-          <w:color w:val="1E1B18"/>
+          <w:color w:val="1F2A1F"/>
           <w:sz w:val="21"/>
           <w:szCs w:val="21"/>
         </w:rPr>
@@ -2317,7 +2978,7 @@
       <w:r>
         <w:rPr>
           <w:rFonts w:ascii="Calibri" w:cs="Calibri" w:eastAsia="Calibri" w:hAnsi="Calibri"/>
-          <w:color w:val="857A6E"/>
+          <w:color w:val="5B6559"/>
           <w:sz w:val="21"/>
           <w:szCs w:val="21"/>
         </w:rPr>
@@ -2333,7 +2994,7 @@
           <w:rFonts w:ascii="Calibri" w:cs="Calibri" w:eastAsia="Calibri" w:hAnsi="Calibri"/>
           <w:b/>
           <w:bCs/>
-          <w:color w:val="1E1B18"/>
+          <w:color w:val="1F2A1F"/>
           <w:sz w:val="21"/>
           <w:szCs w:val="21"/>
         </w:rPr>
@@ -2342,7 +3003,7 @@
       <w:r>
         <w:rPr>
           <w:rFonts w:ascii="Calibri" w:cs="Calibri" w:eastAsia="Calibri" w:hAnsi="Calibri"/>
-          <w:color w:val="857A6E"/>
+          <w:color w:val="5B6559"/>
           <w:sz w:val="21"/>
           <w:szCs w:val="21"/>
         </w:rPr>
@@ -2358,7 +3019,7 @@
           <w:rFonts w:ascii="Calibri" w:cs="Calibri" w:eastAsia="Calibri" w:hAnsi="Calibri"/>
           <w:b/>
           <w:bCs/>
-          <w:color w:val="1E1B18"/>
+          <w:color w:val="1F2A1F"/>
           <w:sz w:val="21"/>
           <w:szCs w:val="21"/>
         </w:rPr>
@@ -2367,7 +3028,7 @@
       <w:r>
         <w:rPr>
           <w:rFonts w:ascii="Calibri" w:cs="Calibri" w:eastAsia="Calibri" w:hAnsi="Calibri"/>
-          <w:color w:val="857A6E"/>
+          <w:color w:val="5B6559"/>
           <w:sz w:val="21"/>
           <w:szCs w:val="21"/>
         </w:rPr>
@@ -2383,7 +3044,7 @@
           <w:rFonts w:ascii="Calibri" w:cs="Calibri" w:eastAsia="Calibri" w:hAnsi="Calibri"/>
           <w:b/>
           <w:bCs/>
-          <w:color w:val="1E1B18"/>
+          <w:color w:val="1F2A1F"/>
           <w:sz w:val="21"/>
           <w:szCs w:val="21"/>
         </w:rPr>
@@ -2392,7 +3053,7 @@
       <w:r>
         <w:rPr>
           <w:rFonts w:ascii="Calibri" w:cs="Calibri" w:eastAsia="Calibri" w:hAnsi="Calibri"/>
-          <w:color w:val="857A6E"/>
+          <w:color w:val="5B6559"/>
           <w:sz w:val="21"/>
           <w:szCs w:val="21"/>
         </w:rPr>
@@ -2408,7 +3069,7 @@
           <w:rFonts w:ascii="Calibri" w:cs="Calibri" w:eastAsia="Calibri" w:hAnsi="Calibri"/>
           <w:b/>
           <w:bCs/>
-          <w:color w:val="1E1B18"/>
+          <w:color w:val="1F2A1F"/>
           <w:sz w:val="21"/>
           <w:szCs w:val="21"/>
         </w:rPr>
@@ -2417,7 +3078,7 @@
       <w:r>
         <w:rPr>
           <w:rFonts w:ascii="Calibri" w:cs="Calibri" w:eastAsia="Calibri" w:hAnsi="Calibri"/>
-          <w:color w:val="857A6E"/>
+          <w:color w:val="5B6559"/>
           <w:sz w:val="21"/>
           <w:szCs w:val="21"/>
         </w:rPr>
@@ -2438,7 +3099,7 @@
           <w:rFonts w:ascii="Georgia" w:cs="Georgia" w:eastAsia="Georgia" w:hAnsi="Georgia"/>
           <w:b/>
           <w:bCs/>
-          <w:color w:val="1E1B18"/>
+          <w:color w:val="1F2A1F"/>
           <w:sz w:val="24"/>
           <w:szCs w:val="24"/>
         </w:rPr>
@@ -2454,17 +3115,17 @@
           <w:rFonts w:ascii="Calibri" w:cs="Calibri" w:eastAsia="Calibri" w:hAnsi="Calibri"/>
           <w:b/>
           <w:bCs/>
-          <w:color w:val="1E1B18"/>
+          <w:color w:val="1F2A1F"/>
           <w:sz w:val="20"/>
           <w:szCs w:val="20"/>
         </w:rPr>
         <w:t xml:space="preserve">Tamaño medio del hogar en España (2023): </w:t>
       </w:r>
-      <w:hyperlink w:history="1" r:id="rIdlbesi3ud4-bbd24dhyzp-">
+      <w:hyperlink w:history="1" r:id="rId3yqxbktnozssf4wz29weh">
         <w:r>
           <w:rPr>
             <w:rFonts w:ascii="Calibri" w:cs="Calibri" w:eastAsia="Calibri" w:hAnsi="Calibri"/>
-            <w:color w:val="B5651D"/>
+            <w:color w:val="C6821E"/>
             <w:sz w:val="20"/>
             <w:szCs w:val="20"/>
             <w:u w:val="single"/>
@@ -2482,17 +3143,17 @@
           <w:rFonts w:ascii="Calibri" w:cs="Calibri" w:eastAsia="Calibri" w:hAnsi="Calibri"/>
           <w:b/>
           <w:bCs/>
-          <w:color w:val="1E1B18"/>
+          <w:color w:val="1F2A1F"/>
           <w:sz w:val="20"/>
           <w:szCs w:val="20"/>
         </w:rPr>
         <w:t xml:space="preserve">Población de A Coruña (INE/IGE, 2024): </w:t>
       </w:r>
-      <w:hyperlink w:history="1" r:id="rId4ly8pnxm6x_jclvm_deoi">
+      <w:hyperlink w:history="1" r:id="rIdbv8aia8bdn0namjbxtrix">
         <w:r>
           <w:rPr>
             <w:rFonts w:ascii="Calibri" w:cs="Calibri" w:eastAsia="Calibri" w:hAnsi="Calibri"/>
-            <w:color w:val="B5651D"/>
+            <w:color w:val="C6821E"/>
             <w:sz w:val="20"/>
             <w:szCs w:val="20"/>
             <w:u w:val="single"/>
@@ -2510,17 +3171,17 @@
           <w:rFonts w:ascii="Calibri" w:cs="Calibri" w:eastAsia="Calibri" w:hAnsi="Calibri"/>
           <w:b/>
           <w:bCs/>
-          <w:color w:val="1E1B18"/>
+          <w:color w:val="1F2A1F"/>
           <w:sz w:val="20"/>
           <w:szCs w:val="20"/>
         </w:rPr>
         <w:t xml:space="preserve">% de universitarios que cambia de ciudad para estudiar: </w:t>
       </w:r>
-      <w:hyperlink w:history="1" r:id="rId998kfmyig8evi03l_bcbz">
+      <w:hyperlink w:history="1" r:id="rIdewux69fcb8gsqlmiv0evu">
         <w:r>
           <w:rPr>
             <w:rFonts w:ascii="Calibri" w:cs="Calibri" w:eastAsia="Calibri" w:hAnsi="Calibri"/>
-            <w:color w:val="B5651D"/>
+            <w:color w:val="C6821E"/>
             <w:sz w:val="20"/>
             <w:szCs w:val="20"/>
             <w:u w:val="single"/>
@@ -2538,17 +3199,17 @@
           <w:rFonts w:ascii="Calibri" w:cs="Calibri" w:eastAsia="Calibri" w:hAnsi="Calibri"/>
           <w:b/>
           <w:bCs/>
-          <w:color w:val="1E1B18"/>
+          <w:color w:val="1F2A1F"/>
           <w:sz w:val="20"/>
           <w:szCs w:val="20"/>
         </w:rPr>
         <w:t xml:space="preserve">Bring! Grocery Shopping List: </w:t>
       </w:r>
-      <w:hyperlink w:history="1" r:id="rIdmpah99pwxy2z2-dkmr2ii">
+      <w:hyperlink w:history="1" r:id="rIdsxus6l1zrxsb--6am9bjh">
         <w:r>
           <w:rPr>
             <w:rFonts w:ascii="Calibri" w:cs="Calibri" w:eastAsia="Calibri" w:hAnsi="Calibri"/>
-            <w:color w:val="B5651D"/>
+            <w:color w:val="C6821E"/>
             <w:sz w:val="20"/>
             <w:szCs w:val="20"/>
             <w:u w:val="single"/>
@@ -2566,17 +3227,17 @@
           <w:rFonts w:ascii="Calibri" w:cs="Calibri" w:eastAsia="Calibri" w:hAnsi="Calibri"/>
           <w:b/>
           <w:bCs/>
-          <w:color w:val="1E1B18"/>
+          <w:color w:val="1F2A1F"/>
           <w:sz w:val="20"/>
           <w:szCs w:val="20"/>
         </w:rPr>
         <w:t xml:space="preserve">AnyList: Grocery Shopping List: </w:t>
       </w:r>
-      <w:hyperlink w:history="1" r:id="rId6oz5vgossazikomszyrks">
+      <w:hyperlink w:history="1" r:id="rIdf4cyfvhwtmk1f98-kqyez">
         <w:r>
           <w:rPr>
             <w:rFonts w:ascii="Calibri" w:cs="Calibri" w:eastAsia="Calibri" w:hAnsi="Calibri"/>
-            <w:color w:val="B5651D"/>
+            <w:color w:val="C6821E"/>
             <w:sz w:val="20"/>
             <w:szCs w:val="20"/>
             <w:u w:val="single"/>
@@ -2599,7 +3260,7 @@
           <w:rFonts w:ascii="Calibri" w:cs="Calibri" w:eastAsia="Calibri" w:hAnsi="Calibri"/>
           <w:i/>
           <w:iCs/>
-          <w:color w:val="857A6E"/>
+          <w:color w:val="5B6559"/>
           <w:sz w:val="19"/>
           <w:szCs w:val="19"/>
         </w:rPr>
@@ -2671,7 +3332,7 @@
     <w:r>
       <w:rPr>
         <w:rFonts w:ascii="Calibri" w:cs="Calibri" w:eastAsia="Calibri" w:hAnsi="Calibri"/>
-        <w:color w:val="857A6E"/>
+        <w:color w:val="5B6559"/>
         <w:sz w:val="15"/>
         <w:szCs w:val="15"/>
       </w:rPr>
@@ -2680,7 +3341,7 @@
     <w:r>
       <w:rPr>
         <w:rFonts w:ascii="Calibri" w:cs="Calibri" w:eastAsia="Calibri" w:hAnsi="Calibri"/>
-        <w:color w:val="857A6E"/>
+        <w:color w:val="5B6559"/>
         <w:sz w:val="15"/>
         <w:szCs w:val="15"/>
       </w:rPr>
@@ -2741,7 +3402,7 @@
   <w:p>
     <w:pPr>
       <w:pBdr>
-        <w:bottom w:val="single" w:color="DDD3C7" w:sz="3" w:space="6"/>
+        <w:bottom w:val="single" w:color="D6DED2" w:sz="3" w:space="6"/>
       </w:pBdr>
       <w:tabs>
         <w:tab w:val="right" w:pos="9026"/>
@@ -2752,7 +3413,7 @@
         <w:rFonts w:ascii="Calibri" w:cs="Calibri" w:eastAsia="Calibri" w:hAnsi="Calibri"/>
         <w:b/>
         <w:bCs/>
-        <w:color w:val="B5651D"/>
+        <w:color w:val="C6821E"/>
         <w:spacing w:val="20"/>
         <w:sz w:val="15"/>
         <w:szCs w:val="15"/>
@@ -2762,7 +3423,7 @@
     <w:r>
       <w:rPr>
         <w:rFonts w:ascii="Calibri" w:cs="Calibri" w:eastAsia="Calibri" w:hAnsi="Calibri"/>
-        <w:color w:val="857A6E"/>
+        <w:color w:val="5B6559"/>
         <w:spacing w:val="20"/>
         <w:sz w:val="15"/>
         <w:szCs w:val="15"/>
@@ -2880,7 +3541,7 @@
     <w:rPrDefault>
       <w:rPr>
         <w:rFonts w:ascii="Calibri" w:cs="Calibri" w:eastAsia="Calibri" w:hAnsi="Calibri"/>
-        <w:color w:val="1E1B18"/>
+        <w:color w:val="1F2A1F"/>
         <w:sz w:val="21"/>
         <w:szCs w:val="21"/>
       </w:rPr>

</xml_diff>

<commit_message>
Regenerate PDF/Word: remove "Galicia" label from survey quote
Co-Authored-By: Claude Sonnet 5 <noreply@anthropic.com>
Claude-Session: https://claude.ai/code/session_012BwrUiCYr6ApYk5hmXyh4o
</commit_message>
<xml_diff>
--- a/docs/larder-overview.docx
+++ b/docs/larder-overview.docx
@@ -1705,7 +1705,7 @@
                 <w:sz w:val="18"/>
                 <w:szCs w:val="18"/>
               </w:rPr>
-              <w:t xml:space="preserve">Se acaba y nadie avisa — Galicia</w:t>
+              <w:t xml:space="preserve">Se acaba y nadie avisa</w:t>
             </w:r>
           </w:p>
         </w:tc>
@@ -3121,7 +3121,7 @@
         </w:rPr>
         <w:t xml:space="preserve">Tamaño medio del hogar en España (2023): </w:t>
       </w:r>
-      <w:hyperlink w:history="1" r:id="rId3yqxbktnozssf4wz29weh">
+      <w:hyperlink w:history="1" r:id="rIdxj1jercaipqkj_4e_wgwg">
         <w:r>
           <w:rPr>
             <w:rFonts w:ascii="Calibri" w:cs="Calibri" w:eastAsia="Calibri" w:hAnsi="Calibri"/>
@@ -3149,7 +3149,7 @@
         </w:rPr>
         <w:t xml:space="preserve">Población de A Coruña (INE/IGE, 2024): </w:t>
       </w:r>
-      <w:hyperlink w:history="1" r:id="rIdbv8aia8bdn0namjbxtrix">
+      <w:hyperlink w:history="1" r:id="rIdlo5bvnh-11nfqdrdk5eiq">
         <w:r>
           <w:rPr>
             <w:rFonts w:ascii="Calibri" w:cs="Calibri" w:eastAsia="Calibri" w:hAnsi="Calibri"/>
@@ -3177,7 +3177,7 @@
         </w:rPr>
         <w:t xml:space="preserve">% de universitarios que cambia de ciudad para estudiar: </w:t>
       </w:r>
-      <w:hyperlink w:history="1" r:id="rIdewux69fcb8gsqlmiv0evu">
+      <w:hyperlink w:history="1" r:id="rIdgiymivr4hgycoqg9zbpt-">
         <w:r>
           <w:rPr>
             <w:rFonts w:ascii="Calibri" w:cs="Calibri" w:eastAsia="Calibri" w:hAnsi="Calibri"/>
@@ -3205,7 +3205,7 @@
         </w:rPr>
         <w:t xml:space="preserve">Bring! Grocery Shopping List: </w:t>
       </w:r>
-      <w:hyperlink w:history="1" r:id="rIdsxus6l1zrxsb--6am9bjh">
+      <w:hyperlink w:history="1" r:id="rIdvsuphyh1hvaytb8wfrhcv">
         <w:r>
           <w:rPr>
             <w:rFonts w:ascii="Calibri" w:cs="Calibri" w:eastAsia="Calibri" w:hAnsi="Calibri"/>
@@ -3233,7 +3233,7 @@
         </w:rPr>
         <w:t xml:space="preserve">AnyList: Grocery Shopping List: </w:t>
       </w:r>
-      <w:hyperlink w:history="1" r:id="rIdf4cyfvhwtmk1f98-kqyez">
+      <w:hyperlink w:history="1" r:id="rIdyvbtuqf4e9t56x605jwbk">
         <w:r>
           <w:rPr>
             <w:rFonts w:ascii="Calibri" w:cs="Calibri" w:eastAsia="Calibri" w:hAnsi="Calibri"/>

</xml_diff>